<commit_message>
modified:   ICD_RN-SIS.docx     Updated the system description of RN and SIS and removed the random text.     moved the Architecture before the Security heading.
</commit_message>
<xml_diff>
--- a/ICD_RN-SIS.docx
+++ b/ICD_RN-SIS.docx
@@ -5959,1318 +5959,249 @@
     <w:p>
       <w:pPr>
         <w:rPr>
-          <w:rFonts w:ascii="Times New Roman" w:hAnsi="Times New Roman" w:cs="Times New Roman"/>
-        </w:rPr>
-      </w:pPr>
-      <w:r>
-        <w:rPr>
-          <w:rFonts w:ascii="Times New Roman" w:hAnsi="Times New Roman" w:cs="Times New Roman"/>
-        </w:rPr>
-        <w:t xml:space="preserve">&lt;Lorem ipsum </w:t>
+          <w:lang w:eastAsia="en-IN"/>
+        </w:rPr>
+      </w:pPr>
+      <w:bookmarkStart w:id="19" w:name="_Toc233365243"/>
+      <w:bookmarkStart w:id="20" w:name="_Toc242088519"/>
+      <w:r>
+        <w:rPr>
+          <w:rFonts w:ascii="Times New Roman" w:hAnsi="Times New Roman"/>
+        </w:rPr>
+        <w:t xml:space="preserve">The Remote Node (RN) is the generic embedded-side client in the </w:t>
       </w:r>
       <w:proofErr w:type="spellStart"/>
       <w:r>
         <w:rPr>
-          <w:rFonts w:ascii="Times New Roman" w:hAnsi="Times New Roman" w:cs="Times New Roman"/>
-        </w:rPr>
-        <w:t>dolor</w:t>
+          <w:rFonts w:ascii="Times New Roman" w:hAnsi="Times New Roman"/>
+        </w:rPr>
+        <w:t>OpenDTS</w:t>
       </w:r>
       <w:proofErr w:type="spellEnd"/>
       <w:r>
         <w:rPr>
-          <w:rFonts w:ascii="Times New Roman" w:hAnsi="Times New Roman" w:cs="Times New Roman"/>
-        </w:rPr>
-        <w:t xml:space="preserve"> </w:t>
-      </w:r>
-      <w:proofErr w:type="gramStart"/>
-      <w:r>
-        <w:rPr>
-          <w:rFonts w:ascii="Times New Roman" w:hAnsi="Times New Roman" w:cs="Times New Roman"/>
-        </w:rPr>
-        <w:t>sit</w:t>
-      </w:r>
-      <w:proofErr w:type="gramEnd"/>
-      <w:r>
-        <w:rPr>
-          <w:rFonts w:ascii="Times New Roman" w:hAnsi="Times New Roman" w:cs="Times New Roman"/>
-        </w:rPr>
-        <w:t xml:space="preserve"> </w:t>
+          <w:rFonts w:ascii="Times New Roman" w:hAnsi="Times New Roman"/>
+        </w:rPr>
+        <w:t xml:space="preserve"> system. It represents an embedded device, controller, gateway, or software-enabled field unit that requires a controlled mechanism for exchanging files and associated metadata with the Secure Infrastructure Server (SIS). The RN hosts the </w:t>
       </w:r>
       <w:proofErr w:type="spellStart"/>
       <w:r>
         <w:rPr>
-          <w:rFonts w:ascii="Times New Roman" w:hAnsi="Times New Roman" w:cs="Times New Roman"/>
-        </w:rPr>
-        <w:t>amet</w:t>
+          <w:rFonts w:ascii="Times New Roman" w:hAnsi="Times New Roman"/>
+        </w:rPr>
+        <w:t>OpenDTS</w:t>
       </w:r>
       <w:proofErr w:type="spellEnd"/>
       <w:r>
         <w:rPr>
-          <w:rFonts w:ascii="Times New Roman" w:hAnsi="Times New Roman" w:cs="Times New Roman"/>
-        </w:rPr>
-        <w:t xml:space="preserve">, </w:t>
-      </w:r>
-      <w:proofErr w:type="spellStart"/>
-      <w:r>
-        <w:rPr>
-          <w:rFonts w:ascii="Times New Roman" w:hAnsi="Times New Roman" w:cs="Times New Roman"/>
-        </w:rPr>
-        <w:t>consectetur</w:t>
-      </w:r>
-      <w:proofErr w:type="spellEnd"/>
-      <w:r>
-        <w:rPr>
-          <w:rFonts w:ascii="Times New Roman" w:hAnsi="Times New Roman" w:cs="Times New Roman"/>
-        </w:rPr>
-        <w:t xml:space="preserve"> </w:t>
-      </w:r>
-      <w:proofErr w:type="spellStart"/>
-      <w:r>
-        <w:rPr>
-          <w:rFonts w:ascii="Times New Roman" w:hAnsi="Times New Roman" w:cs="Times New Roman"/>
-        </w:rPr>
-        <w:t>adipiscing</w:t>
-      </w:r>
-      <w:proofErr w:type="spellEnd"/>
-      <w:r>
-        <w:rPr>
-          <w:rFonts w:ascii="Times New Roman" w:hAnsi="Times New Roman" w:cs="Times New Roman"/>
-        </w:rPr>
-        <w:t xml:space="preserve"> </w:t>
-      </w:r>
-      <w:proofErr w:type="spellStart"/>
-      <w:r>
-        <w:rPr>
-          <w:rFonts w:ascii="Times New Roman" w:hAnsi="Times New Roman" w:cs="Times New Roman"/>
-        </w:rPr>
-        <w:t>elit</w:t>
-      </w:r>
-      <w:proofErr w:type="spellEnd"/>
-      <w:r>
-        <w:rPr>
-          <w:rFonts w:ascii="Times New Roman" w:hAnsi="Times New Roman" w:cs="Times New Roman"/>
-        </w:rPr>
-        <w:t xml:space="preserve">, </w:t>
-      </w:r>
-      <w:proofErr w:type="spellStart"/>
-      <w:r>
-        <w:rPr>
-          <w:rFonts w:ascii="Times New Roman" w:hAnsi="Times New Roman" w:cs="Times New Roman"/>
-        </w:rPr>
-        <w:t>sed</w:t>
-      </w:r>
-      <w:proofErr w:type="spellEnd"/>
-      <w:r>
-        <w:rPr>
-          <w:rFonts w:ascii="Times New Roman" w:hAnsi="Times New Roman" w:cs="Times New Roman"/>
-        </w:rPr>
-        <w:t xml:space="preserve"> do </w:t>
-      </w:r>
-      <w:proofErr w:type="spellStart"/>
-      <w:r>
-        <w:rPr>
-          <w:rFonts w:ascii="Times New Roman" w:hAnsi="Times New Roman" w:cs="Times New Roman"/>
-        </w:rPr>
-        <w:t>eiusmod</w:t>
-      </w:r>
-      <w:proofErr w:type="spellEnd"/>
-      <w:r>
-        <w:rPr>
-          <w:rFonts w:ascii="Times New Roman" w:hAnsi="Times New Roman" w:cs="Times New Roman"/>
-        </w:rPr>
-        <w:t xml:space="preserve"> </w:t>
-      </w:r>
-      <w:proofErr w:type="spellStart"/>
-      <w:r>
-        <w:rPr>
-          <w:rFonts w:ascii="Times New Roman" w:hAnsi="Times New Roman" w:cs="Times New Roman"/>
-        </w:rPr>
-        <w:t>tempor</w:t>
-      </w:r>
-      <w:proofErr w:type="spellEnd"/>
-      <w:r>
-        <w:rPr>
-          <w:rFonts w:ascii="Times New Roman" w:hAnsi="Times New Roman" w:cs="Times New Roman"/>
-        </w:rPr>
-        <w:t xml:space="preserve"> </w:t>
-      </w:r>
-      <w:proofErr w:type="spellStart"/>
-      <w:r>
-        <w:rPr>
-          <w:rFonts w:ascii="Times New Roman" w:hAnsi="Times New Roman" w:cs="Times New Roman"/>
-        </w:rPr>
-        <w:t>incididunt</w:t>
-      </w:r>
-      <w:proofErr w:type="spellEnd"/>
-      <w:r>
-        <w:rPr>
-          <w:rFonts w:ascii="Times New Roman" w:hAnsi="Times New Roman" w:cs="Times New Roman"/>
-        </w:rPr>
-        <w:t xml:space="preserve"> </w:t>
-      </w:r>
-      <w:proofErr w:type="spellStart"/>
-      <w:r>
-        <w:rPr>
-          <w:rFonts w:ascii="Times New Roman" w:hAnsi="Times New Roman" w:cs="Times New Roman"/>
-        </w:rPr>
-        <w:t>ut</w:t>
-      </w:r>
-      <w:proofErr w:type="spellEnd"/>
-      <w:r>
-        <w:rPr>
-          <w:rFonts w:ascii="Times New Roman" w:hAnsi="Times New Roman" w:cs="Times New Roman"/>
-        </w:rPr>
-        <w:t xml:space="preserve"> labore et dolore magna </w:t>
-      </w:r>
-      <w:proofErr w:type="spellStart"/>
-      <w:r>
-        <w:rPr>
-          <w:rFonts w:ascii="Times New Roman" w:hAnsi="Times New Roman" w:cs="Times New Roman"/>
-        </w:rPr>
-        <w:t>aliqua</w:t>
-      </w:r>
-      <w:proofErr w:type="spellEnd"/>
-      <w:r>
-        <w:rPr>
-          <w:rFonts w:ascii="Times New Roman" w:hAnsi="Times New Roman" w:cs="Times New Roman"/>
-        </w:rPr>
-        <w:t xml:space="preserve">. Ut </w:t>
-      </w:r>
-      <w:proofErr w:type="spellStart"/>
-      <w:r>
-        <w:rPr>
-          <w:rFonts w:ascii="Times New Roman" w:hAnsi="Times New Roman" w:cs="Times New Roman"/>
-        </w:rPr>
-        <w:t>enim</w:t>
-      </w:r>
-      <w:proofErr w:type="spellEnd"/>
-      <w:r>
-        <w:rPr>
-          <w:rFonts w:ascii="Times New Roman" w:hAnsi="Times New Roman" w:cs="Times New Roman"/>
-        </w:rPr>
-        <w:t xml:space="preserve"> ad minim </w:t>
-      </w:r>
-      <w:proofErr w:type="spellStart"/>
-      <w:r>
-        <w:rPr>
-          <w:rFonts w:ascii="Times New Roman" w:hAnsi="Times New Roman" w:cs="Times New Roman"/>
-        </w:rPr>
-        <w:t>veniam</w:t>
-      </w:r>
-      <w:proofErr w:type="spellEnd"/>
-      <w:r>
-        <w:rPr>
-          <w:rFonts w:ascii="Times New Roman" w:hAnsi="Times New Roman" w:cs="Times New Roman"/>
-        </w:rPr>
-        <w:t xml:space="preserve">, quis </w:t>
-      </w:r>
-      <w:proofErr w:type="spellStart"/>
-      <w:r>
-        <w:rPr>
-          <w:rFonts w:ascii="Times New Roman" w:hAnsi="Times New Roman" w:cs="Times New Roman"/>
-        </w:rPr>
-        <w:t>nostrud</w:t>
-      </w:r>
-      <w:proofErr w:type="spellEnd"/>
-      <w:r>
-        <w:rPr>
-          <w:rFonts w:ascii="Times New Roman" w:hAnsi="Times New Roman" w:cs="Times New Roman"/>
-        </w:rPr>
-        <w:t xml:space="preserve"> exercitation </w:t>
-      </w:r>
-      <w:proofErr w:type="spellStart"/>
-      <w:r>
-        <w:rPr>
-          <w:rFonts w:ascii="Times New Roman" w:hAnsi="Times New Roman" w:cs="Times New Roman"/>
-        </w:rPr>
-        <w:t>ullamco</w:t>
-      </w:r>
-      <w:proofErr w:type="spellEnd"/>
-      <w:r>
-        <w:rPr>
-          <w:rFonts w:ascii="Times New Roman" w:hAnsi="Times New Roman" w:cs="Times New Roman"/>
-        </w:rPr>
-        <w:t xml:space="preserve"> </w:t>
-      </w:r>
-      <w:proofErr w:type="spellStart"/>
-      <w:r>
-        <w:rPr>
-          <w:rFonts w:ascii="Times New Roman" w:hAnsi="Times New Roman" w:cs="Times New Roman"/>
-        </w:rPr>
-        <w:t>laboris</w:t>
-      </w:r>
-      <w:proofErr w:type="spellEnd"/>
-      <w:r>
-        <w:rPr>
-          <w:rFonts w:ascii="Times New Roman" w:hAnsi="Times New Roman" w:cs="Times New Roman"/>
-        </w:rPr>
-        <w:t xml:space="preserve"> nisi </w:t>
-      </w:r>
-      <w:proofErr w:type="spellStart"/>
-      <w:r>
-        <w:rPr>
-          <w:rFonts w:ascii="Times New Roman" w:hAnsi="Times New Roman" w:cs="Times New Roman"/>
-        </w:rPr>
-        <w:t>ut</w:t>
-      </w:r>
-      <w:proofErr w:type="spellEnd"/>
-      <w:r>
-        <w:rPr>
-          <w:rFonts w:ascii="Times New Roman" w:hAnsi="Times New Roman" w:cs="Times New Roman"/>
-        </w:rPr>
-        <w:t xml:space="preserve"> </w:t>
-      </w:r>
-      <w:proofErr w:type="spellStart"/>
-      <w:r>
-        <w:rPr>
-          <w:rFonts w:ascii="Times New Roman" w:hAnsi="Times New Roman" w:cs="Times New Roman"/>
-        </w:rPr>
-        <w:t>aliquip</w:t>
-      </w:r>
-      <w:proofErr w:type="spellEnd"/>
-      <w:r>
-        <w:rPr>
-          <w:rFonts w:ascii="Times New Roman" w:hAnsi="Times New Roman" w:cs="Times New Roman"/>
-        </w:rPr>
-        <w:t xml:space="preserve"> ex </w:t>
-      </w:r>
-      <w:proofErr w:type="spellStart"/>
-      <w:r>
-        <w:rPr>
-          <w:rFonts w:ascii="Times New Roman" w:hAnsi="Times New Roman" w:cs="Times New Roman"/>
-        </w:rPr>
-        <w:t>ea</w:t>
-      </w:r>
-      <w:proofErr w:type="spellEnd"/>
-      <w:r>
-        <w:rPr>
-          <w:rFonts w:ascii="Times New Roman" w:hAnsi="Times New Roman" w:cs="Times New Roman"/>
-        </w:rPr>
-        <w:t xml:space="preserve"> </w:t>
-      </w:r>
-      <w:proofErr w:type="spellStart"/>
-      <w:r>
-        <w:rPr>
-          <w:rFonts w:ascii="Times New Roman" w:hAnsi="Times New Roman" w:cs="Times New Roman"/>
-        </w:rPr>
-        <w:t>commodo</w:t>
-      </w:r>
-      <w:proofErr w:type="spellEnd"/>
-      <w:r>
-        <w:rPr>
-          <w:rFonts w:ascii="Times New Roman" w:hAnsi="Times New Roman" w:cs="Times New Roman"/>
-        </w:rPr>
-        <w:t xml:space="preserve"> </w:t>
-      </w:r>
-      <w:proofErr w:type="spellStart"/>
-      <w:r>
-        <w:rPr>
-          <w:rFonts w:ascii="Times New Roman" w:hAnsi="Times New Roman" w:cs="Times New Roman"/>
-        </w:rPr>
-        <w:t>consequat</w:t>
-      </w:r>
-      <w:proofErr w:type="spellEnd"/>
-      <w:r>
-        <w:rPr>
-          <w:rFonts w:ascii="Times New Roman" w:hAnsi="Times New Roman" w:cs="Times New Roman"/>
-        </w:rPr>
-        <w:t xml:space="preserve">. Duis </w:t>
-      </w:r>
-      <w:proofErr w:type="spellStart"/>
-      <w:r>
-        <w:rPr>
-          <w:rFonts w:ascii="Times New Roman" w:hAnsi="Times New Roman" w:cs="Times New Roman"/>
-        </w:rPr>
-        <w:t>aute</w:t>
-      </w:r>
-      <w:proofErr w:type="spellEnd"/>
-      <w:r>
-        <w:rPr>
-          <w:rFonts w:ascii="Times New Roman" w:hAnsi="Times New Roman" w:cs="Times New Roman"/>
-        </w:rPr>
-        <w:t xml:space="preserve"> </w:t>
-      </w:r>
-      <w:proofErr w:type="spellStart"/>
-      <w:r>
-        <w:rPr>
-          <w:rFonts w:ascii="Times New Roman" w:hAnsi="Times New Roman" w:cs="Times New Roman"/>
-        </w:rPr>
-        <w:t>irure</w:t>
-      </w:r>
-      <w:proofErr w:type="spellEnd"/>
-      <w:r>
-        <w:rPr>
-          <w:rFonts w:ascii="Times New Roman" w:hAnsi="Times New Roman" w:cs="Times New Roman"/>
-        </w:rPr>
-        <w:t xml:space="preserve"> </w:t>
-      </w:r>
-      <w:proofErr w:type="spellStart"/>
-      <w:r>
-        <w:rPr>
-          <w:rFonts w:ascii="Times New Roman" w:hAnsi="Times New Roman" w:cs="Times New Roman"/>
-        </w:rPr>
-        <w:t>dolor</w:t>
-      </w:r>
-      <w:proofErr w:type="spellEnd"/>
-      <w:r>
-        <w:rPr>
-          <w:rFonts w:ascii="Times New Roman" w:hAnsi="Times New Roman" w:cs="Times New Roman"/>
-        </w:rPr>
-        <w:t xml:space="preserve"> in </w:t>
-      </w:r>
-      <w:proofErr w:type="spellStart"/>
-      <w:r>
-        <w:rPr>
-          <w:rFonts w:ascii="Times New Roman" w:hAnsi="Times New Roman" w:cs="Times New Roman"/>
-        </w:rPr>
-        <w:t>reprehenderit</w:t>
-      </w:r>
-      <w:proofErr w:type="spellEnd"/>
-      <w:r>
-        <w:rPr>
-          <w:rFonts w:ascii="Times New Roman" w:hAnsi="Times New Roman" w:cs="Times New Roman"/>
-        </w:rPr>
-        <w:t xml:space="preserve"> in </w:t>
-      </w:r>
-      <w:proofErr w:type="spellStart"/>
-      <w:r>
-        <w:rPr>
-          <w:rFonts w:ascii="Times New Roman" w:hAnsi="Times New Roman" w:cs="Times New Roman"/>
-        </w:rPr>
-        <w:t>voluptate</w:t>
-      </w:r>
-      <w:proofErr w:type="spellEnd"/>
-      <w:r>
-        <w:rPr>
-          <w:rFonts w:ascii="Times New Roman" w:hAnsi="Times New Roman" w:cs="Times New Roman"/>
-        </w:rPr>
-        <w:t xml:space="preserve"> </w:t>
-      </w:r>
-      <w:proofErr w:type="spellStart"/>
-      <w:r>
-        <w:rPr>
-          <w:rFonts w:ascii="Times New Roman" w:hAnsi="Times New Roman" w:cs="Times New Roman"/>
-        </w:rPr>
-        <w:t>velit</w:t>
-      </w:r>
-      <w:proofErr w:type="spellEnd"/>
-      <w:r>
-        <w:rPr>
-          <w:rFonts w:ascii="Times New Roman" w:hAnsi="Times New Roman" w:cs="Times New Roman"/>
-        </w:rPr>
-        <w:t xml:space="preserve"> esse </w:t>
-      </w:r>
-      <w:proofErr w:type="spellStart"/>
-      <w:r>
-        <w:rPr>
-          <w:rFonts w:ascii="Times New Roman" w:hAnsi="Times New Roman" w:cs="Times New Roman"/>
-        </w:rPr>
-        <w:t>cillum</w:t>
-      </w:r>
-      <w:proofErr w:type="spellEnd"/>
-      <w:r>
-        <w:rPr>
-          <w:rFonts w:ascii="Times New Roman" w:hAnsi="Times New Roman" w:cs="Times New Roman"/>
-        </w:rPr>
-        <w:t xml:space="preserve"> dolore </w:t>
-      </w:r>
-      <w:proofErr w:type="spellStart"/>
-      <w:r>
-        <w:rPr>
-          <w:rFonts w:ascii="Times New Roman" w:hAnsi="Times New Roman" w:cs="Times New Roman"/>
-        </w:rPr>
-        <w:t>eu</w:t>
-      </w:r>
-      <w:proofErr w:type="spellEnd"/>
-      <w:r>
-        <w:rPr>
-          <w:rFonts w:ascii="Times New Roman" w:hAnsi="Times New Roman" w:cs="Times New Roman"/>
-        </w:rPr>
-        <w:t xml:space="preserve"> </w:t>
-      </w:r>
-      <w:proofErr w:type="spellStart"/>
-      <w:r>
-        <w:rPr>
-          <w:rFonts w:ascii="Times New Roman" w:hAnsi="Times New Roman" w:cs="Times New Roman"/>
-        </w:rPr>
-        <w:t>fugiat</w:t>
-      </w:r>
-      <w:proofErr w:type="spellEnd"/>
-      <w:r>
-        <w:rPr>
-          <w:rFonts w:ascii="Times New Roman" w:hAnsi="Times New Roman" w:cs="Times New Roman"/>
-        </w:rPr>
-        <w:t xml:space="preserve"> </w:t>
-      </w:r>
-      <w:proofErr w:type="spellStart"/>
-      <w:r>
-        <w:rPr>
-          <w:rFonts w:ascii="Times New Roman" w:hAnsi="Times New Roman" w:cs="Times New Roman"/>
-        </w:rPr>
-        <w:t>nulla</w:t>
-      </w:r>
-      <w:proofErr w:type="spellEnd"/>
-      <w:r>
-        <w:rPr>
-          <w:rFonts w:ascii="Times New Roman" w:hAnsi="Times New Roman" w:cs="Times New Roman"/>
-        </w:rPr>
-        <w:t xml:space="preserve"> </w:t>
-      </w:r>
-      <w:proofErr w:type="spellStart"/>
-      <w:r>
-        <w:rPr>
-          <w:rFonts w:ascii="Times New Roman" w:hAnsi="Times New Roman" w:cs="Times New Roman"/>
-        </w:rPr>
-        <w:t>pariatur</w:t>
-      </w:r>
-      <w:proofErr w:type="spellEnd"/>
-      <w:r>
-        <w:rPr>
-          <w:rFonts w:ascii="Times New Roman" w:hAnsi="Times New Roman" w:cs="Times New Roman"/>
-        </w:rPr>
-        <w:t xml:space="preserve">. </w:t>
-      </w:r>
-      <w:proofErr w:type="spellStart"/>
-      <w:r>
-        <w:rPr>
-          <w:rFonts w:ascii="Times New Roman" w:hAnsi="Times New Roman" w:cs="Times New Roman"/>
-        </w:rPr>
-        <w:t>Excepteur</w:t>
-      </w:r>
-      <w:proofErr w:type="spellEnd"/>
-      <w:r>
-        <w:rPr>
-          <w:rFonts w:ascii="Times New Roman" w:hAnsi="Times New Roman" w:cs="Times New Roman"/>
-        </w:rPr>
-        <w:t xml:space="preserve"> </w:t>
-      </w:r>
-      <w:proofErr w:type="spellStart"/>
-      <w:r>
-        <w:rPr>
-          <w:rFonts w:ascii="Times New Roman" w:hAnsi="Times New Roman" w:cs="Times New Roman"/>
-        </w:rPr>
-        <w:t>sint</w:t>
-      </w:r>
-      <w:proofErr w:type="spellEnd"/>
-      <w:r>
-        <w:rPr>
-          <w:rFonts w:ascii="Times New Roman" w:hAnsi="Times New Roman" w:cs="Times New Roman"/>
-        </w:rPr>
-        <w:t xml:space="preserve"> </w:t>
-      </w:r>
-      <w:proofErr w:type="spellStart"/>
-      <w:r>
-        <w:rPr>
-          <w:rFonts w:ascii="Times New Roman" w:hAnsi="Times New Roman" w:cs="Times New Roman"/>
-        </w:rPr>
-        <w:t>occaecat</w:t>
-      </w:r>
-      <w:proofErr w:type="spellEnd"/>
-      <w:r>
-        <w:rPr>
-          <w:rFonts w:ascii="Times New Roman" w:hAnsi="Times New Roman" w:cs="Times New Roman"/>
-        </w:rPr>
-        <w:t xml:space="preserve"> </w:t>
-      </w:r>
-      <w:proofErr w:type="spellStart"/>
-      <w:r>
-        <w:rPr>
-          <w:rFonts w:ascii="Times New Roman" w:hAnsi="Times New Roman" w:cs="Times New Roman"/>
-        </w:rPr>
-        <w:t>cupidatat</w:t>
-      </w:r>
-      <w:proofErr w:type="spellEnd"/>
-      <w:r>
-        <w:rPr>
-          <w:rFonts w:ascii="Times New Roman" w:hAnsi="Times New Roman" w:cs="Times New Roman"/>
-        </w:rPr>
-        <w:t xml:space="preserve"> non </w:t>
-      </w:r>
-      <w:proofErr w:type="spellStart"/>
-      <w:r>
-        <w:rPr>
-          <w:rFonts w:ascii="Times New Roman" w:hAnsi="Times New Roman" w:cs="Times New Roman"/>
-        </w:rPr>
-        <w:t>proident</w:t>
-      </w:r>
-      <w:proofErr w:type="spellEnd"/>
-      <w:r>
-        <w:rPr>
-          <w:rFonts w:ascii="Times New Roman" w:hAnsi="Times New Roman" w:cs="Times New Roman"/>
-        </w:rPr>
-        <w:t xml:space="preserve">, sunt in culpa qui </w:t>
-      </w:r>
-      <w:proofErr w:type="spellStart"/>
-      <w:r>
-        <w:rPr>
-          <w:rFonts w:ascii="Times New Roman" w:hAnsi="Times New Roman" w:cs="Times New Roman"/>
-        </w:rPr>
-        <w:t>officia</w:t>
-      </w:r>
-      <w:proofErr w:type="spellEnd"/>
-      <w:r>
-        <w:rPr>
-          <w:rFonts w:ascii="Times New Roman" w:hAnsi="Times New Roman" w:cs="Times New Roman"/>
-        </w:rPr>
-        <w:t xml:space="preserve"> </w:t>
-      </w:r>
-      <w:proofErr w:type="spellStart"/>
-      <w:r>
-        <w:rPr>
-          <w:rFonts w:ascii="Times New Roman" w:hAnsi="Times New Roman" w:cs="Times New Roman"/>
-        </w:rPr>
-        <w:t>deserunt</w:t>
-      </w:r>
-      <w:proofErr w:type="spellEnd"/>
-      <w:r>
-        <w:rPr>
-          <w:rFonts w:ascii="Times New Roman" w:hAnsi="Times New Roman" w:cs="Times New Roman"/>
-        </w:rPr>
-        <w:t xml:space="preserve"> </w:t>
-      </w:r>
-      <w:proofErr w:type="spellStart"/>
-      <w:r>
-        <w:rPr>
-          <w:rFonts w:ascii="Times New Roman" w:hAnsi="Times New Roman" w:cs="Times New Roman"/>
-        </w:rPr>
-        <w:t>mollit</w:t>
-      </w:r>
-      <w:proofErr w:type="spellEnd"/>
-      <w:r>
-        <w:rPr>
-          <w:rFonts w:ascii="Times New Roman" w:hAnsi="Times New Roman" w:cs="Times New Roman"/>
-        </w:rPr>
-        <w:t xml:space="preserve"> </w:t>
-      </w:r>
-      <w:proofErr w:type="spellStart"/>
-      <w:r>
-        <w:rPr>
-          <w:rFonts w:ascii="Times New Roman" w:hAnsi="Times New Roman" w:cs="Times New Roman"/>
-        </w:rPr>
-        <w:t>anim</w:t>
-      </w:r>
-      <w:proofErr w:type="spellEnd"/>
-      <w:r>
-        <w:rPr>
-          <w:rFonts w:ascii="Times New Roman" w:hAnsi="Times New Roman" w:cs="Times New Roman"/>
-        </w:rPr>
-        <w:t xml:space="preserve"> id est </w:t>
-      </w:r>
-      <w:proofErr w:type="spellStart"/>
-      <w:r>
-        <w:rPr>
-          <w:rFonts w:ascii="Times New Roman" w:hAnsi="Times New Roman" w:cs="Times New Roman"/>
-        </w:rPr>
-        <w:t>laborum</w:t>
-      </w:r>
-      <w:proofErr w:type="spellEnd"/>
-      <w:r>
-        <w:rPr>
-          <w:rFonts w:ascii="Times New Roman" w:hAnsi="Times New Roman" w:cs="Times New Roman"/>
-        </w:rPr>
-        <w:t>.&gt;</w:t>
+          <w:rFonts w:ascii="Times New Roman" w:hAnsi="Times New Roman"/>
+        </w:rPr>
+        <w:t xml:space="preserve"> client functionality and initiates communication with the configured SIS endpoint over the defined HTTPS interface. Its design is intended to remain independent of any specific hardware platform, operating system, or application domain so that the same interface can be adopted by different embedded projects.</w:t>
       </w:r>
     </w:p>
     <w:p>
       <w:pPr>
+        <w:rPr>
+          <w:lang w:eastAsia="en-IN"/>
+        </w:rPr>
+      </w:pPr>
+      <w:r>
+        <w:rPr>
+          <w:rFonts w:ascii="Times New Roman" w:hAnsi="Times New Roman"/>
+        </w:rPr>
+        <w:t xml:space="preserve">Within the RN, the </w:t>
+      </w:r>
+      <w:proofErr w:type="spellStart"/>
+      <w:r>
+        <w:rPr>
+          <w:rFonts w:ascii="Times New Roman" w:hAnsi="Times New Roman"/>
+        </w:rPr>
+        <w:t>OpenDTS</w:t>
+      </w:r>
+      <w:proofErr w:type="spellEnd"/>
+      <w:r>
+        <w:rPr>
+          <w:rFonts w:ascii="Times New Roman" w:hAnsi="Times New Roman"/>
+        </w:rPr>
+        <w:t xml:space="preserve"> client manages the local transfer workflow. It identifies the RN through its configured node identifier, queries the SIS for available content, requests complete or partial downloads, submits locally generated content, and reports inventory, transfer status, and validation results. The RN may store received or outgoing content in project-defined directories and shall maintain sufficient transfer information to support interruption handling, retries, and resumable transfers where applicable. After receiving content, the RN is responsible for verifying its integrity using the metadata supplied by the SIS before making the content available to the local application.</w:t>
+      </w:r>
+    </w:p>
+    <w:p>
+      <w:pPr>
+        <w:rPr>
+          <w:lang w:eastAsia="en-IN"/>
+        </w:rPr>
+      </w:pPr>
+      <w:r>
+        <w:rPr>
+          <w:rFonts w:ascii="Times New Roman" w:hAnsi="Times New Roman"/>
+        </w:rPr>
+        <w:t xml:space="preserve">The RN is expected to operate under typical embedded-system constraints, which may include limited processing capacity, restricted memory and storage, intermittent network connectivity, and application-specific availability requirements. Accordingly, the </w:t>
+      </w:r>
+      <w:proofErr w:type="spellStart"/>
+      <w:r>
+        <w:rPr>
+          <w:rFonts w:ascii="Times New Roman" w:hAnsi="Times New Roman"/>
+        </w:rPr>
+        <w:t>OpenDTS</w:t>
+      </w:r>
+      <w:proofErr w:type="spellEnd"/>
+      <w:r>
+        <w:rPr>
+          <w:rFonts w:ascii="Times New Roman" w:hAnsi="Times New Roman"/>
+        </w:rPr>
+        <w:t xml:space="preserve"> client shall separate the common transfer functions from the project-specific application logic. Configuration items such as the SIS endpoint, local transfer directories, node identity, transfer limits, retry behaviour, and applicable security parameters are provided by the deployment. The RN remains responsible for coordinating </w:t>
+      </w:r>
+      <w:proofErr w:type="spellStart"/>
+      <w:r>
+        <w:rPr>
+          <w:rFonts w:ascii="Times New Roman" w:hAnsi="Times New Roman"/>
+        </w:rPr>
+        <w:t>OpenDTS</w:t>
+      </w:r>
+      <w:proofErr w:type="spellEnd"/>
+      <w:r>
+        <w:rPr>
+          <w:rFonts w:ascii="Times New Roman" w:hAnsi="Times New Roman"/>
+        </w:rPr>
+        <w:t xml:space="preserve"> activity with its local application so that transfers do not compromise the primary function of the embedded system.</w:t>
+      </w:r>
+    </w:p>
+    <w:p>
+      <w:pPr>
         <w:pStyle w:val="Heading3"/>
         <w:rPr>
-          <w:rFonts w:ascii="Times New Roman" w:hAnsi="Times New Roman" w:cs="Times New Roman"/>
-        </w:rPr>
-      </w:pPr>
-      <w:bookmarkStart w:id="19" w:name="_Toc233365243"/>
-      <w:bookmarkStart w:id="20" w:name="_Toc242088519"/>
-      <w:r>
-        <w:rPr>
-          <w:rFonts w:ascii="Times New Roman" w:hAnsi="Times New Roman" w:cs="Times New Roman"/>
-        </w:rPr>
-        <w:t>SIS</w:t>
-      </w:r>
+          <w:rFonts w:cstheme="minorBidi"/>
+          <w:lang w:eastAsia="en-IN"/>
+        </w:rPr>
+      </w:pPr>
+      <w:bookmarkStart w:id="21" w:name="_Toc233365244"/>
+      <w:bookmarkStart w:id="22" w:name="_Toc242088520"/>
       <w:bookmarkEnd w:id="19"/>
       <w:bookmarkEnd w:id="20"/>
+      <w:r>
+        <w:t>SIS</w:t>
+      </w:r>
     </w:p>
     <w:p>
       <w:pPr>
         <w:rPr>
-          <w:rFonts w:ascii="Times New Roman" w:hAnsi="Times New Roman" w:cs="Times New Roman"/>
-        </w:rPr>
-      </w:pPr>
-      <w:r>
-        <w:rPr>
-          <w:rFonts w:ascii="Times New Roman" w:hAnsi="Times New Roman" w:cs="Times New Roman"/>
-        </w:rPr>
-        <w:t xml:space="preserve">&lt;Lorem ipsum </w:t>
+          <w:lang w:eastAsia="en-IN"/>
+        </w:rPr>
+      </w:pPr>
+      <w:r>
+        <w:rPr>
+          <w:rFonts w:ascii="Times New Roman" w:hAnsi="Times New Roman"/>
+        </w:rPr>
+        <w:t xml:space="preserve">The Secure Infrastructure Server (SIS) is the server-side component of the </w:t>
       </w:r>
       <w:proofErr w:type="spellStart"/>
       <w:r>
         <w:rPr>
-          <w:rFonts w:ascii="Times New Roman" w:hAnsi="Times New Roman" w:cs="Times New Roman"/>
-        </w:rPr>
-        <w:t>dolor</w:t>
+          <w:rFonts w:ascii="Times New Roman" w:hAnsi="Times New Roman"/>
+        </w:rPr>
+        <w:t>OpenDTS</w:t>
       </w:r>
       <w:proofErr w:type="spellEnd"/>
       <w:r>
         <w:rPr>
-          <w:rFonts w:ascii="Times New Roman" w:hAnsi="Times New Roman" w:cs="Times New Roman"/>
-        </w:rPr>
-        <w:t xml:space="preserve"> </w:t>
-      </w:r>
-      <w:proofErr w:type="gramStart"/>
-      <w:r>
-        <w:rPr>
-          <w:rFonts w:ascii="Times New Roman" w:hAnsi="Times New Roman" w:cs="Times New Roman"/>
-        </w:rPr>
-        <w:t>sit</w:t>
-      </w:r>
-      <w:proofErr w:type="gramEnd"/>
-      <w:r>
-        <w:rPr>
-          <w:rFonts w:ascii="Times New Roman" w:hAnsi="Times New Roman" w:cs="Times New Roman"/>
-        </w:rPr>
-        <w:t xml:space="preserve"> </w:t>
+          <w:rFonts w:ascii="Times New Roman" w:hAnsi="Times New Roman"/>
+        </w:rPr>
+        <w:t xml:space="preserve"> system and provides the central communication and content-transfer services used by one or more Remote Nodes. It exposes the </w:t>
       </w:r>
       <w:proofErr w:type="spellStart"/>
       <w:r>
         <w:rPr>
-          <w:rFonts w:ascii="Times New Roman" w:hAnsi="Times New Roman" w:cs="Times New Roman"/>
-        </w:rPr>
-        <w:t>amet</w:t>
+          <w:rFonts w:ascii="Times New Roman" w:hAnsi="Times New Roman"/>
+        </w:rPr>
+        <w:t>OpenDTS</w:t>
       </w:r>
       <w:proofErr w:type="spellEnd"/>
       <w:r>
         <w:rPr>
-          <w:rFonts w:ascii="Times New Roman" w:hAnsi="Times New Roman" w:cs="Times New Roman"/>
-        </w:rPr>
-        <w:t xml:space="preserve">, </w:t>
-      </w:r>
-      <w:proofErr w:type="spellStart"/>
-      <w:r>
-        <w:rPr>
-          <w:rFonts w:ascii="Times New Roman" w:hAnsi="Times New Roman" w:cs="Times New Roman"/>
-        </w:rPr>
-        <w:t>consectetur</w:t>
-      </w:r>
-      <w:proofErr w:type="spellEnd"/>
-      <w:r>
-        <w:rPr>
-          <w:rFonts w:ascii="Times New Roman" w:hAnsi="Times New Roman" w:cs="Times New Roman"/>
-        </w:rPr>
-        <w:t xml:space="preserve"> </w:t>
-      </w:r>
-      <w:proofErr w:type="spellStart"/>
-      <w:r>
-        <w:rPr>
-          <w:rFonts w:ascii="Times New Roman" w:hAnsi="Times New Roman" w:cs="Times New Roman"/>
-        </w:rPr>
-        <w:t>adipiscing</w:t>
-      </w:r>
-      <w:proofErr w:type="spellEnd"/>
-      <w:r>
-        <w:rPr>
-          <w:rFonts w:ascii="Times New Roman" w:hAnsi="Times New Roman" w:cs="Times New Roman"/>
-        </w:rPr>
-        <w:t xml:space="preserve"> </w:t>
-      </w:r>
-      <w:proofErr w:type="spellStart"/>
-      <w:r>
-        <w:rPr>
-          <w:rFonts w:ascii="Times New Roman" w:hAnsi="Times New Roman" w:cs="Times New Roman"/>
-        </w:rPr>
-        <w:t>elit</w:t>
-      </w:r>
-      <w:proofErr w:type="spellEnd"/>
-      <w:r>
-        <w:rPr>
-          <w:rFonts w:ascii="Times New Roman" w:hAnsi="Times New Roman" w:cs="Times New Roman"/>
-        </w:rPr>
-        <w:t xml:space="preserve">, </w:t>
-      </w:r>
-      <w:proofErr w:type="spellStart"/>
-      <w:r>
-        <w:rPr>
-          <w:rFonts w:ascii="Times New Roman" w:hAnsi="Times New Roman" w:cs="Times New Roman"/>
-        </w:rPr>
-        <w:t>sed</w:t>
-      </w:r>
-      <w:proofErr w:type="spellEnd"/>
-      <w:r>
-        <w:rPr>
-          <w:rFonts w:ascii="Times New Roman" w:hAnsi="Times New Roman" w:cs="Times New Roman"/>
-        </w:rPr>
-        <w:t xml:space="preserve"> do </w:t>
-      </w:r>
-      <w:proofErr w:type="spellStart"/>
-      <w:r>
-        <w:rPr>
-          <w:rFonts w:ascii="Times New Roman" w:hAnsi="Times New Roman" w:cs="Times New Roman"/>
-        </w:rPr>
-        <w:t>eiusmod</w:t>
-      </w:r>
-      <w:proofErr w:type="spellEnd"/>
-      <w:r>
-        <w:rPr>
-          <w:rFonts w:ascii="Times New Roman" w:hAnsi="Times New Roman" w:cs="Times New Roman"/>
-        </w:rPr>
-        <w:t xml:space="preserve"> </w:t>
-      </w:r>
-      <w:proofErr w:type="spellStart"/>
-      <w:r>
-        <w:rPr>
-          <w:rFonts w:ascii="Times New Roman" w:hAnsi="Times New Roman" w:cs="Times New Roman"/>
-        </w:rPr>
-        <w:t>tempor</w:t>
-      </w:r>
-      <w:proofErr w:type="spellEnd"/>
-      <w:r>
-        <w:rPr>
-          <w:rFonts w:ascii="Times New Roman" w:hAnsi="Times New Roman" w:cs="Times New Roman"/>
-        </w:rPr>
-        <w:t xml:space="preserve"> </w:t>
-      </w:r>
-      <w:proofErr w:type="spellStart"/>
-      <w:r>
-        <w:rPr>
-          <w:rFonts w:ascii="Times New Roman" w:hAnsi="Times New Roman" w:cs="Times New Roman"/>
-        </w:rPr>
-        <w:t>incididunt</w:t>
-      </w:r>
-      <w:proofErr w:type="spellEnd"/>
-      <w:r>
-        <w:rPr>
-          <w:rFonts w:ascii="Times New Roman" w:hAnsi="Times New Roman" w:cs="Times New Roman"/>
-        </w:rPr>
-        <w:t xml:space="preserve"> </w:t>
-      </w:r>
-      <w:proofErr w:type="spellStart"/>
-      <w:r>
-        <w:rPr>
-          <w:rFonts w:ascii="Times New Roman" w:hAnsi="Times New Roman" w:cs="Times New Roman"/>
-        </w:rPr>
-        <w:t>ut</w:t>
-      </w:r>
-      <w:proofErr w:type="spellEnd"/>
-      <w:r>
-        <w:rPr>
-          <w:rFonts w:ascii="Times New Roman" w:hAnsi="Times New Roman" w:cs="Times New Roman"/>
-        </w:rPr>
-        <w:t xml:space="preserve"> labore et dolore magna </w:t>
-      </w:r>
-      <w:proofErr w:type="spellStart"/>
-      <w:r>
-        <w:rPr>
-          <w:rFonts w:ascii="Times New Roman" w:hAnsi="Times New Roman" w:cs="Times New Roman"/>
-        </w:rPr>
-        <w:t>aliqua</w:t>
-      </w:r>
-      <w:proofErr w:type="spellEnd"/>
-      <w:r>
-        <w:rPr>
-          <w:rFonts w:ascii="Times New Roman" w:hAnsi="Times New Roman" w:cs="Times New Roman"/>
-        </w:rPr>
-        <w:t xml:space="preserve">. Ut </w:t>
-      </w:r>
-      <w:proofErr w:type="spellStart"/>
-      <w:r>
-        <w:rPr>
-          <w:rFonts w:ascii="Times New Roman" w:hAnsi="Times New Roman" w:cs="Times New Roman"/>
-        </w:rPr>
-        <w:t>enim</w:t>
-      </w:r>
-      <w:proofErr w:type="spellEnd"/>
-      <w:r>
-        <w:rPr>
-          <w:rFonts w:ascii="Times New Roman" w:hAnsi="Times New Roman" w:cs="Times New Roman"/>
-        </w:rPr>
-        <w:t xml:space="preserve"> ad minim </w:t>
-      </w:r>
-      <w:proofErr w:type="spellStart"/>
-      <w:r>
-        <w:rPr>
-          <w:rFonts w:ascii="Times New Roman" w:hAnsi="Times New Roman" w:cs="Times New Roman"/>
-        </w:rPr>
-        <w:t>veniam</w:t>
-      </w:r>
-      <w:proofErr w:type="spellEnd"/>
-      <w:r>
-        <w:rPr>
-          <w:rFonts w:ascii="Times New Roman" w:hAnsi="Times New Roman" w:cs="Times New Roman"/>
-        </w:rPr>
-        <w:t xml:space="preserve">, quis </w:t>
-      </w:r>
-      <w:proofErr w:type="spellStart"/>
-      <w:r>
-        <w:rPr>
-          <w:rFonts w:ascii="Times New Roman" w:hAnsi="Times New Roman" w:cs="Times New Roman"/>
-        </w:rPr>
-        <w:t>nostrud</w:t>
-      </w:r>
-      <w:proofErr w:type="spellEnd"/>
-      <w:r>
-        <w:rPr>
-          <w:rFonts w:ascii="Times New Roman" w:hAnsi="Times New Roman" w:cs="Times New Roman"/>
-        </w:rPr>
-        <w:t xml:space="preserve"> exercitation </w:t>
-      </w:r>
-      <w:proofErr w:type="spellStart"/>
-      <w:r>
-        <w:rPr>
-          <w:rFonts w:ascii="Times New Roman" w:hAnsi="Times New Roman" w:cs="Times New Roman"/>
-        </w:rPr>
-        <w:t>ullamco</w:t>
-      </w:r>
-      <w:proofErr w:type="spellEnd"/>
-      <w:r>
-        <w:rPr>
-          <w:rFonts w:ascii="Times New Roman" w:hAnsi="Times New Roman" w:cs="Times New Roman"/>
-        </w:rPr>
-        <w:t xml:space="preserve"> </w:t>
-      </w:r>
-      <w:proofErr w:type="spellStart"/>
-      <w:r>
-        <w:rPr>
-          <w:rFonts w:ascii="Times New Roman" w:hAnsi="Times New Roman" w:cs="Times New Roman"/>
-        </w:rPr>
-        <w:t>laboris</w:t>
-      </w:r>
-      <w:proofErr w:type="spellEnd"/>
-      <w:r>
-        <w:rPr>
-          <w:rFonts w:ascii="Times New Roman" w:hAnsi="Times New Roman" w:cs="Times New Roman"/>
-        </w:rPr>
-        <w:t xml:space="preserve"> nisi </w:t>
-      </w:r>
-      <w:proofErr w:type="spellStart"/>
-      <w:r>
-        <w:rPr>
-          <w:rFonts w:ascii="Times New Roman" w:hAnsi="Times New Roman" w:cs="Times New Roman"/>
-        </w:rPr>
-        <w:t>ut</w:t>
-      </w:r>
-      <w:proofErr w:type="spellEnd"/>
-      <w:r>
-        <w:rPr>
-          <w:rFonts w:ascii="Times New Roman" w:hAnsi="Times New Roman" w:cs="Times New Roman"/>
-        </w:rPr>
-        <w:t xml:space="preserve"> </w:t>
-      </w:r>
-      <w:proofErr w:type="spellStart"/>
-      <w:r>
-        <w:rPr>
-          <w:rFonts w:ascii="Times New Roman" w:hAnsi="Times New Roman" w:cs="Times New Roman"/>
-        </w:rPr>
-        <w:t>aliquip</w:t>
-      </w:r>
-      <w:proofErr w:type="spellEnd"/>
-      <w:r>
-        <w:rPr>
-          <w:rFonts w:ascii="Times New Roman" w:hAnsi="Times New Roman" w:cs="Times New Roman"/>
-        </w:rPr>
-        <w:t xml:space="preserve"> ex </w:t>
-      </w:r>
-      <w:proofErr w:type="spellStart"/>
-      <w:r>
-        <w:rPr>
-          <w:rFonts w:ascii="Times New Roman" w:hAnsi="Times New Roman" w:cs="Times New Roman"/>
-        </w:rPr>
-        <w:t>ea</w:t>
-      </w:r>
-      <w:proofErr w:type="spellEnd"/>
-      <w:r>
-        <w:rPr>
-          <w:rFonts w:ascii="Times New Roman" w:hAnsi="Times New Roman" w:cs="Times New Roman"/>
-        </w:rPr>
-        <w:t xml:space="preserve"> </w:t>
-      </w:r>
-      <w:proofErr w:type="spellStart"/>
-      <w:r>
-        <w:rPr>
-          <w:rFonts w:ascii="Times New Roman" w:hAnsi="Times New Roman" w:cs="Times New Roman"/>
-        </w:rPr>
-        <w:t>commodo</w:t>
-      </w:r>
-      <w:proofErr w:type="spellEnd"/>
-      <w:r>
-        <w:rPr>
-          <w:rFonts w:ascii="Times New Roman" w:hAnsi="Times New Roman" w:cs="Times New Roman"/>
-        </w:rPr>
-        <w:t xml:space="preserve"> </w:t>
-      </w:r>
-      <w:proofErr w:type="spellStart"/>
-      <w:r>
-        <w:rPr>
-          <w:rFonts w:ascii="Times New Roman" w:hAnsi="Times New Roman" w:cs="Times New Roman"/>
-        </w:rPr>
-        <w:t>consequat</w:t>
-      </w:r>
-      <w:proofErr w:type="spellEnd"/>
-      <w:r>
-        <w:rPr>
-          <w:rFonts w:ascii="Times New Roman" w:hAnsi="Times New Roman" w:cs="Times New Roman"/>
-        </w:rPr>
-        <w:t xml:space="preserve">. Duis </w:t>
-      </w:r>
-      <w:proofErr w:type="spellStart"/>
-      <w:r>
-        <w:rPr>
-          <w:rFonts w:ascii="Times New Roman" w:hAnsi="Times New Roman" w:cs="Times New Roman"/>
-        </w:rPr>
-        <w:t>aute</w:t>
-      </w:r>
-      <w:proofErr w:type="spellEnd"/>
-      <w:r>
-        <w:rPr>
-          <w:rFonts w:ascii="Times New Roman" w:hAnsi="Times New Roman" w:cs="Times New Roman"/>
-        </w:rPr>
-        <w:t xml:space="preserve"> </w:t>
-      </w:r>
-      <w:proofErr w:type="spellStart"/>
-      <w:r>
-        <w:rPr>
-          <w:rFonts w:ascii="Times New Roman" w:hAnsi="Times New Roman" w:cs="Times New Roman"/>
-        </w:rPr>
-        <w:t>irure</w:t>
-      </w:r>
-      <w:proofErr w:type="spellEnd"/>
-      <w:r>
-        <w:rPr>
-          <w:rFonts w:ascii="Times New Roman" w:hAnsi="Times New Roman" w:cs="Times New Roman"/>
-        </w:rPr>
-        <w:t xml:space="preserve"> </w:t>
-      </w:r>
-      <w:proofErr w:type="spellStart"/>
-      <w:r>
-        <w:rPr>
-          <w:rFonts w:ascii="Times New Roman" w:hAnsi="Times New Roman" w:cs="Times New Roman"/>
-        </w:rPr>
-        <w:t>dolor</w:t>
-      </w:r>
-      <w:proofErr w:type="spellEnd"/>
-      <w:r>
-        <w:rPr>
-          <w:rFonts w:ascii="Times New Roman" w:hAnsi="Times New Roman" w:cs="Times New Roman"/>
-        </w:rPr>
-        <w:t xml:space="preserve"> in </w:t>
-      </w:r>
-      <w:proofErr w:type="spellStart"/>
-      <w:r>
-        <w:rPr>
-          <w:rFonts w:ascii="Times New Roman" w:hAnsi="Times New Roman" w:cs="Times New Roman"/>
-        </w:rPr>
-        <w:t>reprehenderit</w:t>
-      </w:r>
-      <w:proofErr w:type="spellEnd"/>
-      <w:r>
-        <w:rPr>
-          <w:rFonts w:ascii="Times New Roman" w:hAnsi="Times New Roman" w:cs="Times New Roman"/>
-        </w:rPr>
-        <w:t xml:space="preserve"> in </w:t>
-      </w:r>
-      <w:proofErr w:type="spellStart"/>
-      <w:r>
-        <w:rPr>
-          <w:rFonts w:ascii="Times New Roman" w:hAnsi="Times New Roman" w:cs="Times New Roman"/>
-        </w:rPr>
-        <w:t>voluptate</w:t>
-      </w:r>
-      <w:proofErr w:type="spellEnd"/>
-      <w:r>
-        <w:rPr>
-          <w:rFonts w:ascii="Times New Roman" w:hAnsi="Times New Roman" w:cs="Times New Roman"/>
-        </w:rPr>
-        <w:t xml:space="preserve"> </w:t>
-      </w:r>
-      <w:proofErr w:type="spellStart"/>
-      <w:r>
-        <w:rPr>
-          <w:rFonts w:ascii="Times New Roman" w:hAnsi="Times New Roman" w:cs="Times New Roman"/>
-        </w:rPr>
-        <w:t>velit</w:t>
-      </w:r>
-      <w:proofErr w:type="spellEnd"/>
-      <w:r>
-        <w:rPr>
-          <w:rFonts w:ascii="Times New Roman" w:hAnsi="Times New Roman" w:cs="Times New Roman"/>
-        </w:rPr>
-        <w:t xml:space="preserve"> esse </w:t>
-      </w:r>
-      <w:proofErr w:type="spellStart"/>
-      <w:r>
-        <w:rPr>
-          <w:rFonts w:ascii="Times New Roman" w:hAnsi="Times New Roman" w:cs="Times New Roman"/>
-        </w:rPr>
-        <w:t>cillum</w:t>
-      </w:r>
-      <w:proofErr w:type="spellEnd"/>
-      <w:r>
-        <w:rPr>
-          <w:rFonts w:ascii="Times New Roman" w:hAnsi="Times New Roman" w:cs="Times New Roman"/>
-        </w:rPr>
-        <w:t xml:space="preserve"> dolore </w:t>
-      </w:r>
-      <w:proofErr w:type="spellStart"/>
-      <w:r>
-        <w:rPr>
-          <w:rFonts w:ascii="Times New Roman" w:hAnsi="Times New Roman" w:cs="Times New Roman"/>
-        </w:rPr>
-        <w:t>eu</w:t>
-      </w:r>
-      <w:proofErr w:type="spellEnd"/>
-      <w:r>
-        <w:rPr>
-          <w:rFonts w:ascii="Times New Roman" w:hAnsi="Times New Roman" w:cs="Times New Roman"/>
-        </w:rPr>
-        <w:t xml:space="preserve"> </w:t>
-      </w:r>
-      <w:proofErr w:type="spellStart"/>
-      <w:r>
-        <w:rPr>
-          <w:rFonts w:ascii="Times New Roman" w:hAnsi="Times New Roman" w:cs="Times New Roman"/>
-        </w:rPr>
-        <w:t>fugiat</w:t>
-      </w:r>
-      <w:proofErr w:type="spellEnd"/>
-      <w:r>
-        <w:rPr>
-          <w:rFonts w:ascii="Times New Roman" w:hAnsi="Times New Roman" w:cs="Times New Roman"/>
-        </w:rPr>
-        <w:t xml:space="preserve"> </w:t>
-      </w:r>
-      <w:proofErr w:type="spellStart"/>
-      <w:r>
-        <w:rPr>
-          <w:rFonts w:ascii="Times New Roman" w:hAnsi="Times New Roman" w:cs="Times New Roman"/>
-        </w:rPr>
-        <w:t>nulla</w:t>
-      </w:r>
-      <w:proofErr w:type="spellEnd"/>
-      <w:r>
-        <w:rPr>
-          <w:rFonts w:ascii="Times New Roman" w:hAnsi="Times New Roman" w:cs="Times New Roman"/>
-        </w:rPr>
-        <w:t xml:space="preserve"> </w:t>
-      </w:r>
-      <w:proofErr w:type="spellStart"/>
-      <w:r>
-        <w:rPr>
-          <w:rFonts w:ascii="Times New Roman" w:hAnsi="Times New Roman" w:cs="Times New Roman"/>
-        </w:rPr>
-        <w:t>pariatur</w:t>
-      </w:r>
-      <w:proofErr w:type="spellEnd"/>
-      <w:r>
-        <w:rPr>
-          <w:rFonts w:ascii="Times New Roman" w:hAnsi="Times New Roman" w:cs="Times New Roman"/>
-        </w:rPr>
-        <w:t xml:space="preserve">. </w:t>
-      </w:r>
-      <w:proofErr w:type="spellStart"/>
-      <w:r>
-        <w:rPr>
-          <w:rFonts w:ascii="Times New Roman" w:hAnsi="Times New Roman" w:cs="Times New Roman"/>
-        </w:rPr>
-        <w:t>Excepteur</w:t>
-      </w:r>
-      <w:proofErr w:type="spellEnd"/>
-      <w:r>
-        <w:rPr>
-          <w:rFonts w:ascii="Times New Roman" w:hAnsi="Times New Roman" w:cs="Times New Roman"/>
-        </w:rPr>
-        <w:t xml:space="preserve"> </w:t>
-      </w:r>
-      <w:proofErr w:type="spellStart"/>
-      <w:r>
-        <w:rPr>
-          <w:rFonts w:ascii="Times New Roman" w:hAnsi="Times New Roman" w:cs="Times New Roman"/>
-        </w:rPr>
-        <w:t>sint</w:t>
-      </w:r>
-      <w:proofErr w:type="spellEnd"/>
-      <w:r>
-        <w:rPr>
-          <w:rFonts w:ascii="Times New Roman" w:hAnsi="Times New Roman" w:cs="Times New Roman"/>
-        </w:rPr>
-        <w:t xml:space="preserve"> </w:t>
-      </w:r>
-      <w:proofErr w:type="spellStart"/>
-      <w:r>
-        <w:rPr>
-          <w:rFonts w:ascii="Times New Roman" w:hAnsi="Times New Roman" w:cs="Times New Roman"/>
-        </w:rPr>
-        <w:t>occaecat</w:t>
-      </w:r>
-      <w:proofErr w:type="spellEnd"/>
-      <w:r>
-        <w:rPr>
-          <w:rFonts w:ascii="Times New Roman" w:hAnsi="Times New Roman" w:cs="Times New Roman"/>
-        </w:rPr>
-        <w:t xml:space="preserve"> </w:t>
-      </w:r>
-      <w:proofErr w:type="spellStart"/>
-      <w:r>
-        <w:rPr>
-          <w:rFonts w:ascii="Times New Roman" w:hAnsi="Times New Roman" w:cs="Times New Roman"/>
-        </w:rPr>
-        <w:t>cupidatat</w:t>
-      </w:r>
-      <w:proofErr w:type="spellEnd"/>
-      <w:r>
-        <w:rPr>
-          <w:rFonts w:ascii="Times New Roman" w:hAnsi="Times New Roman" w:cs="Times New Roman"/>
-        </w:rPr>
-        <w:t xml:space="preserve"> non </w:t>
-      </w:r>
-      <w:proofErr w:type="spellStart"/>
-      <w:r>
-        <w:rPr>
-          <w:rFonts w:ascii="Times New Roman" w:hAnsi="Times New Roman" w:cs="Times New Roman"/>
-        </w:rPr>
-        <w:t>proident</w:t>
-      </w:r>
-      <w:proofErr w:type="spellEnd"/>
-      <w:r>
-        <w:rPr>
-          <w:rFonts w:ascii="Times New Roman" w:hAnsi="Times New Roman" w:cs="Times New Roman"/>
-        </w:rPr>
-        <w:t xml:space="preserve">, sunt in culpa qui </w:t>
-      </w:r>
-      <w:proofErr w:type="spellStart"/>
-      <w:r>
-        <w:rPr>
-          <w:rFonts w:ascii="Times New Roman" w:hAnsi="Times New Roman" w:cs="Times New Roman"/>
-        </w:rPr>
-        <w:t>officia</w:t>
-      </w:r>
-      <w:proofErr w:type="spellEnd"/>
-      <w:r>
-        <w:rPr>
-          <w:rFonts w:ascii="Times New Roman" w:hAnsi="Times New Roman" w:cs="Times New Roman"/>
-        </w:rPr>
-        <w:t xml:space="preserve"> </w:t>
-      </w:r>
-      <w:proofErr w:type="spellStart"/>
-      <w:r>
-        <w:rPr>
-          <w:rFonts w:ascii="Times New Roman" w:hAnsi="Times New Roman" w:cs="Times New Roman"/>
-        </w:rPr>
-        <w:t>deserunt</w:t>
-      </w:r>
-      <w:proofErr w:type="spellEnd"/>
-      <w:r>
-        <w:rPr>
-          <w:rFonts w:ascii="Times New Roman" w:hAnsi="Times New Roman" w:cs="Times New Roman"/>
-        </w:rPr>
-        <w:t xml:space="preserve"> </w:t>
-      </w:r>
-      <w:proofErr w:type="spellStart"/>
-      <w:r>
-        <w:rPr>
-          <w:rFonts w:ascii="Times New Roman" w:hAnsi="Times New Roman" w:cs="Times New Roman"/>
-        </w:rPr>
-        <w:t>mollit</w:t>
-      </w:r>
-      <w:proofErr w:type="spellEnd"/>
-      <w:r>
-        <w:rPr>
-          <w:rFonts w:ascii="Times New Roman" w:hAnsi="Times New Roman" w:cs="Times New Roman"/>
-        </w:rPr>
-        <w:t xml:space="preserve"> </w:t>
-      </w:r>
-      <w:proofErr w:type="spellStart"/>
-      <w:r>
-        <w:rPr>
-          <w:rFonts w:ascii="Times New Roman" w:hAnsi="Times New Roman" w:cs="Times New Roman"/>
-        </w:rPr>
-        <w:t>anim</w:t>
-      </w:r>
-      <w:proofErr w:type="spellEnd"/>
-      <w:r>
-        <w:rPr>
-          <w:rFonts w:ascii="Times New Roman" w:hAnsi="Times New Roman" w:cs="Times New Roman"/>
-        </w:rPr>
-        <w:t xml:space="preserve"> id est </w:t>
-      </w:r>
-      <w:proofErr w:type="spellStart"/>
-      <w:r>
-        <w:rPr>
-          <w:rFonts w:ascii="Times New Roman" w:hAnsi="Times New Roman" w:cs="Times New Roman"/>
-        </w:rPr>
-        <w:t>laborum</w:t>
-      </w:r>
-      <w:proofErr w:type="spellEnd"/>
-      <w:r>
-        <w:rPr>
-          <w:rFonts w:ascii="Times New Roman" w:hAnsi="Times New Roman" w:cs="Times New Roman"/>
-        </w:rPr>
-        <w:t>.&gt;</w:t>
+          <w:rFonts w:ascii="Times New Roman" w:hAnsi="Times New Roman"/>
+        </w:rPr>
+        <w:t xml:space="preserve"> HTTPS APIs, receives requests initiated by RNs, and returns the corresponding content, metadata, transfer state, or operation result. The SIS provides a common server interface so that embedded clients can exchange data without depending on the implementation details of the underlying storage, hosting platform, or infrastructure environment.</w:t>
       </w:r>
     </w:p>
     <w:p>
       <w:pPr>
-        <w:pStyle w:val="Heading1"/>
-        <w:jc w:val="both"/>
-        <w:rPr>
-          <w:rFonts w:ascii="Times New Roman" w:hAnsi="Times New Roman" w:cs="Times New Roman"/>
-        </w:rPr>
-      </w:pPr>
-      <w:bookmarkStart w:id="21" w:name="_Toc233365244"/>
-      <w:bookmarkStart w:id="22" w:name="_Toc242088520"/>
-      <w:r>
-        <w:rPr>
-          <w:rFonts w:ascii="Times New Roman" w:hAnsi="Times New Roman" w:cs="Times New Roman"/>
-        </w:rPr>
-        <w:t>Interface Security and Cryptography</w:t>
-      </w:r>
+        <w:rPr>
+          <w:lang w:eastAsia="en-IN"/>
+        </w:rPr>
+      </w:pPr>
+      <w:r>
+        <w:rPr>
+          <w:rFonts w:ascii="Times New Roman" w:hAnsi="Times New Roman"/>
+        </w:rPr>
+        <w:t xml:space="preserve">The SIS manages content made available for inbound transfer from SIS to RN and accepts content submitted through outbound transfer from RN to SIS. Its responsibilities include maintaining the logical transfer areas, providing file and folder metadata, serving full or requested byte ranges, receiving uploaded data, and preserving the information required to track a transfer throughout its lifecycle. The SIS also receives node inventory, progress </w:t>
+      </w:r>
+      <w:r>
+        <w:rPr>
+          <w:rFonts w:ascii="Times New Roman" w:hAnsi="Times New Roman"/>
+        </w:rPr>
+        <w:lastRenderedPageBreak/>
+        <w:t>updates, and validation results published by RNs, enabling the server side to maintain an overall view of content distribution and collection activities.</w:t>
+      </w:r>
+    </w:p>
+    <w:p>
+      <w:pPr>
+        <w:rPr>
+          <w:lang w:eastAsia="en-IN"/>
+        </w:rPr>
+      </w:pPr>
+      <w:r>
+        <w:rPr>
+          <w:rFonts w:ascii="Times New Roman" w:hAnsi="Times New Roman"/>
+        </w:rPr>
+        <w:t xml:space="preserve">For each request, the SIS identifies the requesting RN from the interface information, validates the request according to the configured deployment policies, performs the requested </w:t>
+      </w:r>
+      <w:proofErr w:type="spellStart"/>
+      <w:r>
+        <w:rPr>
+          <w:rFonts w:ascii="Times New Roman" w:hAnsi="Times New Roman"/>
+        </w:rPr>
+        <w:t>OpenDTS</w:t>
+      </w:r>
+      <w:proofErr w:type="spellEnd"/>
+      <w:r>
+        <w:rPr>
+          <w:rFonts w:ascii="Times New Roman" w:hAnsi="Times New Roman"/>
+        </w:rPr>
+        <w:t xml:space="preserve"> operation, and returns a defined success or error response. The server shall support multiple RNs while keeping their content, transfer state, and operational records logically associated with the correct node. The SIS may use internal services such as persistent storage, databases, monitoring, or administrative tools; however, these implementation details are outside the RN-SIS interface unless they affect externally observable behaviour. From the RN perspective, the SIS acts as the authoritative </w:t>
+      </w:r>
+      <w:proofErr w:type="spellStart"/>
+      <w:r>
+        <w:rPr>
+          <w:rFonts w:ascii="Times New Roman" w:hAnsi="Times New Roman"/>
+        </w:rPr>
+        <w:t>OpenDTS</w:t>
+      </w:r>
+      <w:proofErr w:type="spellEnd"/>
+      <w:r>
+        <w:rPr>
+          <w:rFonts w:ascii="Times New Roman" w:hAnsi="Times New Roman"/>
+        </w:rPr>
+        <w:t xml:space="preserve"> endpoint for content discovery, transfer coordination, data reception, and status collection.</w:t>
+      </w:r>
+    </w:p>
+    <w:p>
+      <w:pPr>
+        <w:pStyle w:val="Heading2"/>
+        <w:rPr>
+          <w:rFonts w:ascii="Times New Roman" w:hAnsi="Times New Roman" w:cs="Times New Roman"/>
+        </w:rPr>
+      </w:pPr>
+      <w:bookmarkStart w:id="23" w:name="_Toc242088522"/>
       <w:bookmarkEnd w:id="21"/>
       <w:bookmarkEnd w:id="22"/>
-    </w:p>
-    <w:p>
-      <w:pPr>
-        <w:rPr>
-          <w:rFonts w:ascii="Times New Roman" w:hAnsi="Times New Roman" w:cs="Times New Roman"/>
-        </w:rPr>
-      </w:pPr>
-      <w:r>
-        <w:rPr>
-          <w:rFonts w:ascii="Times New Roman" w:hAnsi="Times New Roman" w:cs="Times New Roman"/>
-        </w:rPr>
-        <w:t>Any type of security is out of scope for th</w:t>
-      </w:r>
-      <w:r>
-        <w:rPr>
-          <w:rFonts w:ascii="Times New Roman" w:hAnsi="Times New Roman" w:cs="Times New Roman"/>
-        </w:rPr>
-        <w:t xml:space="preserve">is version of the System. The intention at this stage is to </w:t>
-      </w:r>
-      <w:r>
-        <w:rPr>
-          <w:rFonts w:ascii="Times New Roman" w:hAnsi="Times New Roman" w:cs="Times New Roman"/>
-        </w:rPr>
-        <w:t xml:space="preserve">enable the data transfer. The </w:t>
-      </w:r>
-      <w:r>
-        <w:rPr>
-          <w:rFonts w:ascii="Times New Roman" w:hAnsi="Times New Roman" w:cs="Times New Roman"/>
-        </w:rPr>
-        <w:t>next version of the system will focus on the security.</w:t>
-      </w:r>
-    </w:p>
-    <w:p>
-      <w:pPr>
-        <w:pStyle w:val="Heading1"/>
-        <w:rPr>
-          <w:rFonts w:ascii="Times New Roman" w:hAnsi="Times New Roman" w:cs="Times New Roman"/>
-        </w:rPr>
-      </w:pPr>
-      <w:bookmarkStart w:id="23" w:name="_Toc233365245"/>
-      <w:bookmarkStart w:id="24" w:name="_Toc242088521"/>
-      <w:bookmarkStart w:id="25" w:name="_Toc242088522"/>
       <w:r>
         <w:rPr>
           <w:rFonts w:ascii="Times New Roman" w:hAnsi="Times New Roman" w:cs="Times New Roman"/>
         </w:rPr>
         <w:t>Transfer Mechanism /Architecture</w:t>
       </w:r>
-      <w:bookmarkEnd w:id="25"/>
+      <w:bookmarkEnd w:id="23"/>
     </w:p>
     <w:p>
       <w:pPr>
@@ -7371,13 +6302,10 @@
     </w:p>
     <w:p>
       <w:pPr>
-        <w:pStyle w:val="Heading2"/>
-      </w:pPr>
-      <w:r>
-        <w:t>Outbound</w:t>
-      </w:r>
-      <w:r>
-        <w:t xml:space="preserve"> Transfer</w:t>
+        <w:pStyle w:val="Heading3"/>
+      </w:pPr>
+      <w:r>
+        <w:t>Outbound Transfer</w:t>
       </w:r>
     </w:p>
     <w:p>
@@ -7997,10 +6925,9 @@
     </w:p>
     <w:p>
       <w:pPr>
-        <w:pStyle w:val="Heading2"/>
-      </w:pPr>
-      <w:r>
-        <w:lastRenderedPageBreak/>
+        <w:pStyle w:val="Heading3"/>
+      </w:pPr>
+      <w:r>
         <w:t>Inbound Transfer</w:t>
       </w:r>
     </w:p>
@@ -8623,31 +7550,14 @@
     <w:p>
       <w:pPr>
         <w:pStyle w:val="Heading1"/>
-        <w:jc w:val="both"/>
-        <w:rPr>
-          <w:rFonts w:ascii="Times New Roman" w:hAnsi="Times New Roman" w:cs="Times New Roman"/>
-        </w:rPr>
-      </w:pPr>
-      <w:r>
-        <w:rPr>
-          <w:rFonts w:ascii="Times New Roman" w:hAnsi="Times New Roman" w:cs="Times New Roman"/>
-        </w:rPr>
-        <w:t>RN</w:t>
-      </w:r>
-      <w:r>
-        <w:rPr>
-          <w:rFonts w:ascii="Times New Roman" w:hAnsi="Times New Roman" w:cs="Times New Roman"/>
-        </w:rPr>
-        <w:t xml:space="preserve"> </w:t>
-      </w:r>
-      <w:r>
-        <w:rPr>
-          <w:rFonts w:ascii="Times New Roman" w:hAnsi="Times New Roman" w:cs="Times New Roman"/>
-        </w:rPr>
-        <w:t>Configurations</w:t>
-      </w:r>
-      <w:bookmarkEnd w:id="23"/>
-      <w:bookmarkEnd w:id="24"/>
+        <w:rPr>
+          <w:rFonts w:cstheme="minorBidi"/>
+          <w:lang w:eastAsia="en-IN"/>
+        </w:rPr>
+      </w:pPr>
+      <w:r>
+        <w:t>Interface Security and Cryptography</w:t>
+      </w:r>
     </w:p>
     <w:p>
       <w:pPr>
@@ -8659,609 +7569,25 @@
         <w:rPr>
           <w:rFonts w:ascii="Times New Roman" w:hAnsi="Times New Roman" w:cs="Times New Roman"/>
         </w:rPr>
-        <w:t xml:space="preserve">&lt;Lorem ipsum </w:t>
-      </w:r>
-      <w:proofErr w:type="spellStart"/>
-      <w:r>
-        <w:rPr>
-          <w:rFonts w:ascii="Times New Roman" w:hAnsi="Times New Roman" w:cs="Times New Roman"/>
-        </w:rPr>
-        <w:t>dolor</w:t>
-      </w:r>
-      <w:proofErr w:type="spellEnd"/>
-      <w:r>
-        <w:rPr>
-          <w:rFonts w:ascii="Times New Roman" w:hAnsi="Times New Roman" w:cs="Times New Roman"/>
-        </w:rPr>
-        <w:t xml:space="preserve"> </w:t>
-      </w:r>
-      <w:proofErr w:type="gramStart"/>
-      <w:r>
-        <w:rPr>
-          <w:rFonts w:ascii="Times New Roman" w:hAnsi="Times New Roman" w:cs="Times New Roman"/>
-        </w:rPr>
-        <w:t>sit</w:t>
-      </w:r>
-      <w:proofErr w:type="gramEnd"/>
-      <w:r>
-        <w:rPr>
-          <w:rFonts w:ascii="Times New Roman" w:hAnsi="Times New Roman" w:cs="Times New Roman"/>
-        </w:rPr>
-        <w:t xml:space="preserve"> </w:t>
-      </w:r>
-      <w:proofErr w:type="spellStart"/>
-      <w:r>
-        <w:rPr>
-          <w:rFonts w:ascii="Times New Roman" w:hAnsi="Times New Roman" w:cs="Times New Roman"/>
-        </w:rPr>
-        <w:t>amet</w:t>
-      </w:r>
-      <w:proofErr w:type="spellEnd"/>
-      <w:r>
-        <w:rPr>
-          <w:rFonts w:ascii="Times New Roman" w:hAnsi="Times New Roman" w:cs="Times New Roman"/>
-        </w:rPr>
-        <w:t xml:space="preserve">, </w:t>
-      </w:r>
-      <w:proofErr w:type="spellStart"/>
-      <w:r>
-        <w:rPr>
-          <w:rFonts w:ascii="Times New Roman" w:hAnsi="Times New Roman" w:cs="Times New Roman"/>
-        </w:rPr>
-        <w:t>consectetur</w:t>
-      </w:r>
-      <w:proofErr w:type="spellEnd"/>
-      <w:r>
-        <w:rPr>
-          <w:rFonts w:ascii="Times New Roman" w:hAnsi="Times New Roman" w:cs="Times New Roman"/>
-        </w:rPr>
-        <w:t xml:space="preserve"> </w:t>
-      </w:r>
-      <w:proofErr w:type="spellStart"/>
-      <w:r>
-        <w:rPr>
-          <w:rFonts w:ascii="Times New Roman" w:hAnsi="Times New Roman" w:cs="Times New Roman"/>
-        </w:rPr>
-        <w:t>adipiscing</w:t>
-      </w:r>
-      <w:proofErr w:type="spellEnd"/>
-      <w:r>
-        <w:rPr>
-          <w:rFonts w:ascii="Times New Roman" w:hAnsi="Times New Roman" w:cs="Times New Roman"/>
-        </w:rPr>
-        <w:t xml:space="preserve"> </w:t>
-      </w:r>
-      <w:proofErr w:type="spellStart"/>
-      <w:r>
-        <w:rPr>
-          <w:rFonts w:ascii="Times New Roman" w:hAnsi="Times New Roman" w:cs="Times New Roman"/>
-        </w:rPr>
-        <w:t>elit</w:t>
-      </w:r>
-      <w:proofErr w:type="spellEnd"/>
-      <w:r>
-        <w:rPr>
-          <w:rFonts w:ascii="Times New Roman" w:hAnsi="Times New Roman" w:cs="Times New Roman"/>
-        </w:rPr>
-        <w:t xml:space="preserve">, </w:t>
-      </w:r>
-      <w:proofErr w:type="spellStart"/>
-      <w:r>
-        <w:rPr>
-          <w:rFonts w:ascii="Times New Roman" w:hAnsi="Times New Roman" w:cs="Times New Roman"/>
-        </w:rPr>
-        <w:t>sed</w:t>
-      </w:r>
-      <w:proofErr w:type="spellEnd"/>
-      <w:r>
-        <w:rPr>
-          <w:rFonts w:ascii="Times New Roman" w:hAnsi="Times New Roman" w:cs="Times New Roman"/>
-        </w:rPr>
-        <w:t xml:space="preserve"> do </w:t>
-      </w:r>
-      <w:proofErr w:type="spellStart"/>
-      <w:r>
-        <w:rPr>
-          <w:rFonts w:ascii="Times New Roman" w:hAnsi="Times New Roman" w:cs="Times New Roman"/>
-        </w:rPr>
-        <w:t>eiusmod</w:t>
-      </w:r>
-      <w:proofErr w:type="spellEnd"/>
-      <w:r>
-        <w:rPr>
-          <w:rFonts w:ascii="Times New Roman" w:hAnsi="Times New Roman" w:cs="Times New Roman"/>
-        </w:rPr>
-        <w:t xml:space="preserve"> </w:t>
-      </w:r>
-      <w:proofErr w:type="spellStart"/>
-      <w:r>
-        <w:rPr>
-          <w:rFonts w:ascii="Times New Roman" w:hAnsi="Times New Roman" w:cs="Times New Roman"/>
-        </w:rPr>
-        <w:t>tempor</w:t>
-      </w:r>
-      <w:proofErr w:type="spellEnd"/>
-      <w:r>
-        <w:rPr>
-          <w:rFonts w:ascii="Times New Roman" w:hAnsi="Times New Roman" w:cs="Times New Roman"/>
-        </w:rPr>
-        <w:t xml:space="preserve"> </w:t>
-      </w:r>
-      <w:proofErr w:type="spellStart"/>
-      <w:r>
-        <w:rPr>
-          <w:rFonts w:ascii="Times New Roman" w:hAnsi="Times New Roman" w:cs="Times New Roman"/>
-        </w:rPr>
-        <w:t>incididunt</w:t>
-      </w:r>
-      <w:proofErr w:type="spellEnd"/>
-      <w:r>
-        <w:rPr>
-          <w:rFonts w:ascii="Times New Roman" w:hAnsi="Times New Roman" w:cs="Times New Roman"/>
-        </w:rPr>
-        <w:t xml:space="preserve"> </w:t>
-      </w:r>
-      <w:proofErr w:type="spellStart"/>
-      <w:r>
-        <w:rPr>
-          <w:rFonts w:ascii="Times New Roman" w:hAnsi="Times New Roman" w:cs="Times New Roman"/>
-        </w:rPr>
-        <w:t>ut</w:t>
-      </w:r>
-      <w:proofErr w:type="spellEnd"/>
-      <w:r>
-        <w:rPr>
-          <w:rFonts w:ascii="Times New Roman" w:hAnsi="Times New Roman" w:cs="Times New Roman"/>
-        </w:rPr>
-        <w:t xml:space="preserve"> labore et dolore magna </w:t>
-      </w:r>
-      <w:proofErr w:type="spellStart"/>
-      <w:r>
-        <w:rPr>
-          <w:rFonts w:ascii="Times New Roman" w:hAnsi="Times New Roman" w:cs="Times New Roman"/>
-        </w:rPr>
-        <w:t>aliqua</w:t>
-      </w:r>
-      <w:proofErr w:type="spellEnd"/>
-      <w:r>
-        <w:rPr>
-          <w:rFonts w:ascii="Times New Roman" w:hAnsi="Times New Roman" w:cs="Times New Roman"/>
-        </w:rPr>
-        <w:t xml:space="preserve">. Ut </w:t>
-      </w:r>
-      <w:proofErr w:type="spellStart"/>
-      <w:r>
-        <w:rPr>
-          <w:rFonts w:ascii="Times New Roman" w:hAnsi="Times New Roman" w:cs="Times New Roman"/>
-        </w:rPr>
-        <w:t>enim</w:t>
-      </w:r>
-      <w:proofErr w:type="spellEnd"/>
-      <w:r>
-        <w:rPr>
-          <w:rFonts w:ascii="Times New Roman" w:hAnsi="Times New Roman" w:cs="Times New Roman"/>
-        </w:rPr>
-        <w:t xml:space="preserve"> ad minim </w:t>
-      </w:r>
-      <w:proofErr w:type="spellStart"/>
-      <w:r>
-        <w:rPr>
-          <w:rFonts w:ascii="Times New Roman" w:hAnsi="Times New Roman" w:cs="Times New Roman"/>
-        </w:rPr>
-        <w:t>veniam</w:t>
-      </w:r>
-      <w:proofErr w:type="spellEnd"/>
-      <w:r>
-        <w:rPr>
-          <w:rFonts w:ascii="Times New Roman" w:hAnsi="Times New Roman" w:cs="Times New Roman"/>
-        </w:rPr>
-        <w:t xml:space="preserve">, quis </w:t>
-      </w:r>
-      <w:proofErr w:type="spellStart"/>
-      <w:r>
-        <w:rPr>
-          <w:rFonts w:ascii="Times New Roman" w:hAnsi="Times New Roman" w:cs="Times New Roman"/>
-        </w:rPr>
-        <w:t>nostrud</w:t>
-      </w:r>
-      <w:proofErr w:type="spellEnd"/>
-      <w:r>
-        <w:rPr>
-          <w:rFonts w:ascii="Times New Roman" w:hAnsi="Times New Roman" w:cs="Times New Roman"/>
-        </w:rPr>
-        <w:t xml:space="preserve"> exercitation </w:t>
-      </w:r>
-      <w:proofErr w:type="spellStart"/>
-      <w:r>
-        <w:rPr>
-          <w:rFonts w:ascii="Times New Roman" w:hAnsi="Times New Roman" w:cs="Times New Roman"/>
-        </w:rPr>
-        <w:t>ullamco</w:t>
-      </w:r>
-      <w:proofErr w:type="spellEnd"/>
-      <w:r>
-        <w:rPr>
-          <w:rFonts w:ascii="Times New Roman" w:hAnsi="Times New Roman" w:cs="Times New Roman"/>
-        </w:rPr>
-        <w:t xml:space="preserve"> </w:t>
-      </w:r>
-      <w:proofErr w:type="spellStart"/>
-      <w:r>
-        <w:rPr>
-          <w:rFonts w:ascii="Times New Roman" w:hAnsi="Times New Roman" w:cs="Times New Roman"/>
-        </w:rPr>
-        <w:t>laboris</w:t>
-      </w:r>
-      <w:proofErr w:type="spellEnd"/>
-      <w:r>
-        <w:rPr>
-          <w:rFonts w:ascii="Times New Roman" w:hAnsi="Times New Roman" w:cs="Times New Roman"/>
-        </w:rPr>
-        <w:t xml:space="preserve"> nisi </w:t>
-      </w:r>
-      <w:proofErr w:type="spellStart"/>
-      <w:r>
-        <w:rPr>
-          <w:rFonts w:ascii="Times New Roman" w:hAnsi="Times New Roman" w:cs="Times New Roman"/>
-        </w:rPr>
-        <w:t>ut</w:t>
-      </w:r>
-      <w:proofErr w:type="spellEnd"/>
-      <w:r>
-        <w:rPr>
-          <w:rFonts w:ascii="Times New Roman" w:hAnsi="Times New Roman" w:cs="Times New Roman"/>
-        </w:rPr>
-        <w:t xml:space="preserve"> </w:t>
-      </w:r>
-      <w:proofErr w:type="spellStart"/>
-      <w:r>
-        <w:rPr>
-          <w:rFonts w:ascii="Times New Roman" w:hAnsi="Times New Roman" w:cs="Times New Roman"/>
-        </w:rPr>
-        <w:t>aliquip</w:t>
-      </w:r>
-      <w:proofErr w:type="spellEnd"/>
-      <w:r>
-        <w:rPr>
-          <w:rFonts w:ascii="Times New Roman" w:hAnsi="Times New Roman" w:cs="Times New Roman"/>
-        </w:rPr>
-        <w:t xml:space="preserve"> ex </w:t>
-      </w:r>
-      <w:proofErr w:type="spellStart"/>
-      <w:r>
-        <w:rPr>
-          <w:rFonts w:ascii="Times New Roman" w:hAnsi="Times New Roman" w:cs="Times New Roman"/>
-        </w:rPr>
-        <w:t>ea</w:t>
-      </w:r>
-      <w:proofErr w:type="spellEnd"/>
-      <w:r>
-        <w:rPr>
-          <w:rFonts w:ascii="Times New Roman" w:hAnsi="Times New Roman" w:cs="Times New Roman"/>
-        </w:rPr>
-        <w:t xml:space="preserve"> </w:t>
-      </w:r>
-      <w:proofErr w:type="spellStart"/>
-      <w:r>
-        <w:rPr>
-          <w:rFonts w:ascii="Times New Roman" w:hAnsi="Times New Roman" w:cs="Times New Roman"/>
-        </w:rPr>
-        <w:t>commodo</w:t>
-      </w:r>
-      <w:proofErr w:type="spellEnd"/>
-      <w:r>
-        <w:rPr>
-          <w:rFonts w:ascii="Times New Roman" w:hAnsi="Times New Roman" w:cs="Times New Roman"/>
-        </w:rPr>
-        <w:t xml:space="preserve"> </w:t>
-      </w:r>
-      <w:proofErr w:type="spellStart"/>
-      <w:r>
-        <w:rPr>
-          <w:rFonts w:ascii="Times New Roman" w:hAnsi="Times New Roman" w:cs="Times New Roman"/>
-        </w:rPr>
-        <w:t>consequat</w:t>
-      </w:r>
-      <w:proofErr w:type="spellEnd"/>
-      <w:r>
-        <w:rPr>
-          <w:rFonts w:ascii="Times New Roman" w:hAnsi="Times New Roman" w:cs="Times New Roman"/>
-        </w:rPr>
-        <w:t xml:space="preserve">. Duis </w:t>
-      </w:r>
-      <w:proofErr w:type="spellStart"/>
-      <w:r>
-        <w:rPr>
-          <w:rFonts w:ascii="Times New Roman" w:hAnsi="Times New Roman" w:cs="Times New Roman"/>
-        </w:rPr>
-        <w:t>aute</w:t>
-      </w:r>
-      <w:proofErr w:type="spellEnd"/>
-      <w:r>
-        <w:rPr>
-          <w:rFonts w:ascii="Times New Roman" w:hAnsi="Times New Roman" w:cs="Times New Roman"/>
-        </w:rPr>
-        <w:t xml:space="preserve"> </w:t>
-      </w:r>
-      <w:proofErr w:type="spellStart"/>
-      <w:r>
-        <w:rPr>
-          <w:rFonts w:ascii="Times New Roman" w:hAnsi="Times New Roman" w:cs="Times New Roman"/>
-        </w:rPr>
-        <w:t>irure</w:t>
-      </w:r>
-      <w:proofErr w:type="spellEnd"/>
-      <w:r>
-        <w:rPr>
-          <w:rFonts w:ascii="Times New Roman" w:hAnsi="Times New Roman" w:cs="Times New Roman"/>
-        </w:rPr>
-        <w:t xml:space="preserve"> </w:t>
-      </w:r>
-      <w:proofErr w:type="spellStart"/>
-      <w:r>
-        <w:rPr>
-          <w:rFonts w:ascii="Times New Roman" w:hAnsi="Times New Roman" w:cs="Times New Roman"/>
-        </w:rPr>
-        <w:t>dolor</w:t>
-      </w:r>
-      <w:proofErr w:type="spellEnd"/>
-      <w:r>
-        <w:rPr>
-          <w:rFonts w:ascii="Times New Roman" w:hAnsi="Times New Roman" w:cs="Times New Roman"/>
-        </w:rPr>
-        <w:t xml:space="preserve"> in </w:t>
-      </w:r>
-      <w:proofErr w:type="spellStart"/>
-      <w:r>
-        <w:rPr>
-          <w:rFonts w:ascii="Times New Roman" w:hAnsi="Times New Roman" w:cs="Times New Roman"/>
-        </w:rPr>
-        <w:t>reprehenderit</w:t>
-      </w:r>
-      <w:proofErr w:type="spellEnd"/>
-      <w:r>
-        <w:rPr>
-          <w:rFonts w:ascii="Times New Roman" w:hAnsi="Times New Roman" w:cs="Times New Roman"/>
-        </w:rPr>
-        <w:t xml:space="preserve"> in </w:t>
-      </w:r>
-      <w:proofErr w:type="spellStart"/>
-      <w:r>
-        <w:rPr>
-          <w:rFonts w:ascii="Times New Roman" w:hAnsi="Times New Roman" w:cs="Times New Roman"/>
-        </w:rPr>
-        <w:t>voluptate</w:t>
-      </w:r>
-      <w:proofErr w:type="spellEnd"/>
-      <w:r>
-        <w:rPr>
-          <w:rFonts w:ascii="Times New Roman" w:hAnsi="Times New Roman" w:cs="Times New Roman"/>
-        </w:rPr>
-        <w:t xml:space="preserve"> </w:t>
-      </w:r>
-      <w:proofErr w:type="spellStart"/>
-      <w:r>
-        <w:rPr>
-          <w:rFonts w:ascii="Times New Roman" w:hAnsi="Times New Roman" w:cs="Times New Roman"/>
-        </w:rPr>
-        <w:t>velit</w:t>
-      </w:r>
-      <w:proofErr w:type="spellEnd"/>
-      <w:r>
-        <w:rPr>
-          <w:rFonts w:ascii="Times New Roman" w:hAnsi="Times New Roman" w:cs="Times New Roman"/>
-        </w:rPr>
-        <w:t xml:space="preserve"> esse </w:t>
-      </w:r>
-      <w:proofErr w:type="spellStart"/>
-      <w:r>
-        <w:rPr>
-          <w:rFonts w:ascii="Times New Roman" w:hAnsi="Times New Roman" w:cs="Times New Roman"/>
-        </w:rPr>
-        <w:t>cillum</w:t>
-      </w:r>
-      <w:proofErr w:type="spellEnd"/>
-      <w:r>
-        <w:rPr>
-          <w:rFonts w:ascii="Times New Roman" w:hAnsi="Times New Roman" w:cs="Times New Roman"/>
-        </w:rPr>
-        <w:t xml:space="preserve"> dolore </w:t>
-      </w:r>
-      <w:proofErr w:type="spellStart"/>
-      <w:r>
-        <w:rPr>
-          <w:rFonts w:ascii="Times New Roman" w:hAnsi="Times New Roman" w:cs="Times New Roman"/>
-        </w:rPr>
-        <w:t>eu</w:t>
-      </w:r>
-      <w:proofErr w:type="spellEnd"/>
-      <w:r>
-        <w:rPr>
-          <w:rFonts w:ascii="Times New Roman" w:hAnsi="Times New Roman" w:cs="Times New Roman"/>
-        </w:rPr>
-        <w:t xml:space="preserve"> </w:t>
-      </w:r>
-      <w:proofErr w:type="spellStart"/>
-      <w:r>
-        <w:rPr>
-          <w:rFonts w:ascii="Times New Roman" w:hAnsi="Times New Roman" w:cs="Times New Roman"/>
-        </w:rPr>
-        <w:t>fugiat</w:t>
-      </w:r>
-      <w:proofErr w:type="spellEnd"/>
-      <w:r>
-        <w:rPr>
-          <w:rFonts w:ascii="Times New Roman" w:hAnsi="Times New Roman" w:cs="Times New Roman"/>
-        </w:rPr>
-        <w:t xml:space="preserve"> </w:t>
-      </w:r>
-      <w:proofErr w:type="spellStart"/>
-      <w:r>
-        <w:rPr>
-          <w:rFonts w:ascii="Times New Roman" w:hAnsi="Times New Roman" w:cs="Times New Roman"/>
-        </w:rPr>
-        <w:t>nulla</w:t>
-      </w:r>
-      <w:proofErr w:type="spellEnd"/>
-      <w:r>
-        <w:rPr>
-          <w:rFonts w:ascii="Times New Roman" w:hAnsi="Times New Roman" w:cs="Times New Roman"/>
-        </w:rPr>
-        <w:t xml:space="preserve"> </w:t>
-      </w:r>
-      <w:proofErr w:type="spellStart"/>
-      <w:r>
-        <w:rPr>
-          <w:rFonts w:ascii="Times New Roman" w:hAnsi="Times New Roman" w:cs="Times New Roman"/>
-        </w:rPr>
-        <w:t>pariatur</w:t>
-      </w:r>
-      <w:proofErr w:type="spellEnd"/>
-      <w:r>
-        <w:rPr>
-          <w:rFonts w:ascii="Times New Roman" w:hAnsi="Times New Roman" w:cs="Times New Roman"/>
-        </w:rPr>
-        <w:t xml:space="preserve">. </w:t>
-      </w:r>
-      <w:proofErr w:type="spellStart"/>
-      <w:r>
-        <w:rPr>
-          <w:rFonts w:ascii="Times New Roman" w:hAnsi="Times New Roman" w:cs="Times New Roman"/>
-        </w:rPr>
-        <w:t>Excepteur</w:t>
-      </w:r>
-      <w:proofErr w:type="spellEnd"/>
-      <w:r>
-        <w:rPr>
-          <w:rFonts w:ascii="Times New Roman" w:hAnsi="Times New Roman" w:cs="Times New Roman"/>
-        </w:rPr>
-        <w:t xml:space="preserve"> </w:t>
-      </w:r>
-      <w:proofErr w:type="spellStart"/>
-      <w:r>
-        <w:rPr>
-          <w:rFonts w:ascii="Times New Roman" w:hAnsi="Times New Roman" w:cs="Times New Roman"/>
-        </w:rPr>
-        <w:t>sint</w:t>
-      </w:r>
-      <w:proofErr w:type="spellEnd"/>
-      <w:r>
-        <w:rPr>
-          <w:rFonts w:ascii="Times New Roman" w:hAnsi="Times New Roman" w:cs="Times New Roman"/>
-        </w:rPr>
-        <w:t xml:space="preserve"> </w:t>
-      </w:r>
-      <w:proofErr w:type="spellStart"/>
-      <w:r>
-        <w:rPr>
-          <w:rFonts w:ascii="Times New Roman" w:hAnsi="Times New Roman" w:cs="Times New Roman"/>
-        </w:rPr>
-        <w:t>occaecat</w:t>
-      </w:r>
-      <w:proofErr w:type="spellEnd"/>
-      <w:r>
-        <w:rPr>
-          <w:rFonts w:ascii="Times New Roman" w:hAnsi="Times New Roman" w:cs="Times New Roman"/>
-        </w:rPr>
-        <w:t xml:space="preserve"> </w:t>
-      </w:r>
-      <w:proofErr w:type="spellStart"/>
-      <w:r>
-        <w:rPr>
-          <w:rFonts w:ascii="Times New Roman" w:hAnsi="Times New Roman" w:cs="Times New Roman"/>
-        </w:rPr>
-        <w:t>cupidatat</w:t>
-      </w:r>
-      <w:proofErr w:type="spellEnd"/>
-      <w:r>
-        <w:rPr>
-          <w:rFonts w:ascii="Times New Roman" w:hAnsi="Times New Roman" w:cs="Times New Roman"/>
-        </w:rPr>
-        <w:t xml:space="preserve"> non </w:t>
-      </w:r>
-      <w:proofErr w:type="spellStart"/>
-      <w:r>
-        <w:rPr>
-          <w:rFonts w:ascii="Times New Roman" w:hAnsi="Times New Roman" w:cs="Times New Roman"/>
-        </w:rPr>
-        <w:t>proident</w:t>
-      </w:r>
-      <w:proofErr w:type="spellEnd"/>
-      <w:r>
-        <w:rPr>
-          <w:rFonts w:ascii="Times New Roman" w:hAnsi="Times New Roman" w:cs="Times New Roman"/>
-        </w:rPr>
-        <w:t xml:space="preserve">, sunt in culpa qui </w:t>
-      </w:r>
-      <w:proofErr w:type="spellStart"/>
-      <w:r>
-        <w:rPr>
-          <w:rFonts w:ascii="Times New Roman" w:hAnsi="Times New Roman" w:cs="Times New Roman"/>
-        </w:rPr>
-        <w:t>officia</w:t>
-      </w:r>
-      <w:proofErr w:type="spellEnd"/>
-      <w:r>
-        <w:rPr>
-          <w:rFonts w:ascii="Times New Roman" w:hAnsi="Times New Roman" w:cs="Times New Roman"/>
-        </w:rPr>
-        <w:t xml:space="preserve"> </w:t>
-      </w:r>
-      <w:proofErr w:type="spellStart"/>
-      <w:r>
-        <w:rPr>
-          <w:rFonts w:ascii="Times New Roman" w:hAnsi="Times New Roman" w:cs="Times New Roman"/>
-        </w:rPr>
-        <w:t>deserunt</w:t>
-      </w:r>
-      <w:proofErr w:type="spellEnd"/>
-      <w:r>
-        <w:rPr>
-          <w:rFonts w:ascii="Times New Roman" w:hAnsi="Times New Roman" w:cs="Times New Roman"/>
-        </w:rPr>
-        <w:t xml:space="preserve"> </w:t>
-      </w:r>
-      <w:proofErr w:type="spellStart"/>
-      <w:r>
-        <w:rPr>
-          <w:rFonts w:ascii="Times New Roman" w:hAnsi="Times New Roman" w:cs="Times New Roman"/>
-        </w:rPr>
-        <w:t>mollit</w:t>
-      </w:r>
-      <w:proofErr w:type="spellEnd"/>
-      <w:r>
-        <w:rPr>
-          <w:rFonts w:ascii="Times New Roman" w:hAnsi="Times New Roman" w:cs="Times New Roman"/>
-        </w:rPr>
-        <w:t xml:space="preserve"> </w:t>
-      </w:r>
-      <w:proofErr w:type="spellStart"/>
-      <w:r>
-        <w:rPr>
-          <w:rFonts w:ascii="Times New Roman" w:hAnsi="Times New Roman" w:cs="Times New Roman"/>
-        </w:rPr>
-        <w:t>anim</w:t>
-      </w:r>
-      <w:proofErr w:type="spellEnd"/>
-      <w:r>
-        <w:rPr>
-          <w:rFonts w:ascii="Times New Roman" w:hAnsi="Times New Roman" w:cs="Times New Roman"/>
-        </w:rPr>
-        <w:t xml:space="preserve"> id est </w:t>
-      </w:r>
-      <w:proofErr w:type="spellStart"/>
-      <w:r>
-        <w:rPr>
-          <w:rFonts w:ascii="Times New Roman" w:hAnsi="Times New Roman" w:cs="Times New Roman"/>
-        </w:rPr>
-        <w:t>laborum</w:t>
-      </w:r>
-      <w:proofErr w:type="spellEnd"/>
-      <w:r>
-        <w:rPr>
-          <w:rFonts w:ascii="Times New Roman" w:hAnsi="Times New Roman" w:cs="Times New Roman"/>
-        </w:rPr>
-        <w:t>.&gt;</w:t>
+        <w:t>Any type of security is out of scope for th</w:t>
+      </w:r>
+      <w:r>
+        <w:rPr>
+          <w:rFonts w:ascii="Times New Roman" w:hAnsi="Times New Roman" w:cs="Times New Roman"/>
+        </w:rPr>
+        <w:t xml:space="preserve">is version of the System. The intention at this stage is to </w:t>
+      </w:r>
+      <w:r>
+        <w:rPr>
+          <w:rFonts w:ascii="Times New Roman" w:hAnsi="Times New Roman" w:cs="Times New Roman"/>
+        </w:rPr>
+        <w:t xml:space="preserve">enable the data transfer. The </w:t>
+      </w:r>
+      <w:r>
+        <w:rPr>
+          <w:rFonts w:ascii="Times New Roman" w:hAnsi="Times New Roman" w:cs="Times New Roman"/>
+        </w:rPr>
+        <w:t>next version of the system will focus on the security.</w:t>
       </w:r>
     </w:p>
     <w:p>
@@ -9272,17 +7598,29 @@
           <w:rFonts w:ascii="Times New Roman" w:hAnsi="Times New Roman" w:cs="Times New Roman"/>
         </w:rPr>
       </w:pPr>
-      <w:bookmarkStart w:id="26" w:name="_Toc233365247"/>
-      <w:bookmarkStart w:id="27" w:name="_Toc233365246"/>
-      <w:bookmarkStart w:id="28" w:name="_Toc242088523"/>
-      <w:r>
-        <w:rPr>
-          <w:rFonts w:ascii="Times New Roman" w:hAnsi="Times New Roman" w:cs="Times New Roman"/>
-        </w:rPr>
-        <w:t>SIS Configurations</w:t>
-      </w:r>
-      <w:bookmarkEnd w:id="27"/>
-      <w:bookmarkEnd w:id="28"/>
+      <w:bookmarkStart w:id="24" w:name="_Toc233365245"/>
+      <w:bookmarkStart w:id="25" w:name="_Toc242088521"/>
+      <w:r>
+        <w:rPr>
+          <w:rFonts w:ascii="Times New Roman" w:hAnsi="Times New Roman" w:cs="Times New Roman"/>
+        </w:rPr>
+        <w:lastRenderedPageBreak/>
+        <w:t>RN</w:t>
+      </w:r>
+      <w:r>
+        <w:rPr>
+          <w:rFonts w:ascii="Times New Roman" w:hAnsi="Times New Roman" w:cs="Times New Roman"/>
+        </w:rPr>
+        <w:t xml:space="preserve"> </w:t>
+      </w:r>
+      <w:r>
+        <w:rPr>
+          <w:rFonts w:ascii="Times New Roman" w:hAnsi="Times New Roman" w:cs="Times New Roman"/>
+        </w:rPr>
+        <w:t>Configurations</w:t>
+      </w:r>
+      <w:bookmarkEnd w:id="24"/>
+      <w:bookmarkEnd w:id="25"/>
     </w:p>
     <w:p>
       <w:pPr>
@@ -9901,13 +8239,648 @@
     </w:p>
     <w:p>
       <w:pPr>
-        <w:rPr>
-          <w:rFonts w:ascii="Times New Roman" w:hAnsi="Times New Roman" w:cs="Times New Roman"/>
-        </w:rPr>
-      </w:pPr>
+        <w:pStyle w:val="Heading1"/>
+        <w:jc w:val="both"/>
+        <w:rPr>
+          <w:rFonts w:ascii="Times New Roman" w:hAnsi="Times New Roman" w:cs="Times New Roman"/>
+        </w:rPr>
+      </w:pPr>
+      <w:bookmarkStart w:id="26" w:name="_Toc233365246"/>
+      <w:bookmarkStart w:id="27" w:name="_Toc242088523"/>
+      <w:bookmarkStart w:id="28" w:name="_Toc233365247"/>
+      <w:r>
+        <w:rPr>
+          <w:rFonts w:ascii="Times New Roman" w:hAnsi="Times New Roman" w:cs="Times New Roman"/>
+        </w:rPr>
+        <w:t>SIS Configurations</w:t>
+      </w:r>
+      <w:bookmarkEnd w:id="26"/>
+      <w:bookmarkEnd w:id="27"/>
     </w:p>
     <w:p>
       <w:pPr>
+        <w:rPr>
+          <w:rFonts w:ascii="Times New Roman" w:hAnsi="Times New Roman" w:cs="Times New Roman"/>
+        </w:rPr>
+      </w:pPr>
+      <w:r>
+        <w:rPr>
+          <w:rFonts w:ascii="Times New Roman" w:hAnsi="Times New Roman" w:cs="Times New Roman"/>
+        </w:rPr>
+        <w:t xml:space="preserve">&lt;Lorem ipsum </w:t>
+      </w:r>
+      <w:proofErr w:type="spellStart"/>
+      <w:r>
+        <w:rPr>
+          <w:rFonts w:ascii="Times New Roman" w:hAnsi="Times New Roman" w:cs="Times New Roman"/>
+        </w:rPr>
+        <w:t>dolor</w:t>
+      </w:r>
+      <w:proofErr w:type="spellEnd"/>
+      <w:r>
+        <w:rPr>
+          <w:rFonts w:ascii="Times New Roman" w:hAnsi="Times New Roman" w:cs="Times New Roman"/>
+        </w:rPr>
+        <w:t xml:space="preserve"> </w:t>
+      </w:r>
+      <w:proofErr w:type="gramStart"/>
+      <w:r>
+        <w:rPr>
+          <w:rFonts w:ascii="Times New Roman" w:hAnsi="Times New Roman" w:cs="Times New Roman"/>
+        </w:rPr>
+        <w:t>sit</w:t>
+      </w:r>
+      <w:proofErr w:type="gramEnd"/>
+      <w:r>
+        <w:rPr>
+          <w:rFonts w:ascii="Times New Roman" w:hAnsi="Times New Roman" w:cs="Times New Roman"/>
+        </w:rPr>
+        <w:t xml:space="preserve"> </w:t>
+      </w:r>
+      <w:proofErr w:type="spellStart"/>
+      <w:r>
+        <w:rPr>
+          <w:rFonts w:ascii="Times New Roman" w:hAnsi="Times New Roman" w:cs="Times New Roman"/>
+        </w:rPr>
+        <w:t>amet</w:t>
+      </w:r>
+      <w:proofErr w:type="spellEnd"/>
+      <w:r>
+        <w:rPr>
+          <w:rFonts w:ascii="Times New Roman" w:hAnsi="Times New Roman" w:cs="Times New Roman"/>
+        </w:rPr>
+        <w:t xml:space="preserve">, </w:t>
+      </w:r>
+      <w:proofErr w:type="spellStart"/>
+      <w:r>
+        <w:rPr>
+          <w:rFonts w:ascii="Times New Roman" w:hAnsi="Times New Roman" w:cs="Times New Roman"/>
+        </w:rPr>
+        <w:t>consectetur</w:t>
+      </w:r>
+      <w:proofErr w:type="spellEnd"/>
+      <w:r>
+        <w:rPr>
+          <w:rFonts w:ascii="Times New Roman" w:hAnsi="Times New Roman" w:cs="Times New Roman"/>
+        </w:rPr>
+        <w:t xml:space="preserve"> </w:t>
+      </w:r>
+      <w:proofErr w:type="spellStart"/>
+      <w:r>
+        <w:rPr>
+          <w:rFonts w:ascii="Times New Roman" w:hAnsi="Times New Roman" w:cs="Times New Roman"/>
+        </w:rPr>
+        <w:t>adipiscing</w:t>
+      </w:r>
+      <w:proofErr w:type="spellEnd"/>
+      <w:r>
+        <w:rPr>
+          <w:rFonts w:ascii="Times New Roman" w:hAnsi="Times New Roman" w:cs="Times New Roman"/>
+        </w:rPr>
+        <w:t xml:space="preserve"> </w:t>
+      </w:r>
+      <w:proofErr w:type="spellStart"/>
+      <w:r>
+        <w:rPr>
+          <w:rFonts w:ascii="Times New Roman" w:hAnsi="Times New Roman" w:cs="Times New Roman"/>
+        </w:rPr>
+        <w:t>elit</w:t>
+      </w:r>
+      <w:proofErr w:type="spellEnd"/>
+      <w:r>
+        <w:rPr>
+          <w:rFonts w:ascii="Times New Roman" w:hAnsi="Times New Roman" w:cs="Times New Roman"/>
+        </w:rPr>
+        <w:t xml:space="preserve">, </w:t>
+      </w:r>
+      <w:proofErr w:type="spellStart"/>
+      <w:r>
+        <w:rPr>
+          <w:rFonts w:ascii="Times New Roman" w:hAnsi="Times New Roman" w:cs="Times New Roman"/>
+        </w:rPr>
+        <w:t>sed</w:t>
+      </w:r>
+      <w:proofErr w:type="spellEnd"/>
+      <w:r>
+        <w:rPr>
+          <w:rFonts w:ascii="Times New Roman" w:hAnsi="Times New Roman" w:cs="Times New Roman"/>
+        </w:rPr>
+        <w:t xml:space="preserve"> do </w:t>
+      </w:r>
+      <w:proofErr w:type="spellStart"/>
+      <w:r>
+        <w:rPr>
+          <w:rFonts w:ascii="Times New Roman" w:hAnsi="Times New Roman" w:cs="Times New Roman"/>
+        </w:rPr>
+        <w:t>eiusmod</w:t>
+      </w:r>
+      <w:proofErr w:type="spellEnd"/>
+      <w:r>
+        <w:rPr>
+          <w:rFonts w:ascii="Times New Roman" w:hAnsi="Times New Roman" w:cs="Times New Roman"/>
+        </w:rPr>
+        <w:t xml:space="preserve"> </w:t>
+      </w:r>
+      <w:proofErr w:type="spellStart"/>
+      <w:r>
+        <w:rPr>
+          <w:rFonts w:ascii="Times New Roman" w:hAnsi="Times New Roman" w:cs="Times New Roman"/>
+        </w:rPr>
+        <w:t>tempor</w:t>
+      </w:r>
+      <w:proofErr w:type="spellEnd"/>
+      <w:r>
+        <w:rPr>
+          <w:rFonts w:ascii="Times New Roman" w:hAnsi="Times New Roman" w:cs="Times New Roman"/>
+        </w:rPr>
+        <w:t xml:space="preserve"> </w:t>
+      </w:r>
+      <w:proofErr w:type="spellStart"/>
+      <w:r>
+        <w:rPr>
+          <w:rFonts w:ascii="Times New Roman" w:hAnsi="Times New Roman" w:cs="Times New Roman"/>
+        </w:rPr>
+        <w:t>incididunt</w:t>
+      </w:r>
+      <w:proofErr w:type="spellEnd"/>
+      <w:r>
+        <w:rPr>
+          <w:rFonts w:ascii="Times New Roman" w:hAnsi="Times New Roman" w:cs="Times New Roman"/>
+        </w:rPr>
+        <w:t xml:space="preserve"> </w:t>
+      </w:r>
+      <w:proofErr w:type="spellStart"/>
+      <w:r>
+        <w:rPr>
+          <w:rFonts w:ascii="Times New Roman" w:hAnsi="Times New Roman" w:cs="Times New Roman"/>
+        </w:rPr>
+        <w:t>ut</w:t>
+      </w:r>
+      <w:proofErr w:type="spellEnd"/>
+      <w:r>
+        <w:rPr>
+          <w:rFonts w:ascii="Times New Roman" w:hAnsi="Times New Roman" w:cs="Times New Roman"/>
+        </w:rPr>
+        <w:t xml:space="preserve"> labore et dolore magna </w:t>
+      </w:r>
+      <w:proofErr w:type="spellStart"/>
+      <w:r>
+        <w:rPr>
+          <w:rFonts w:ascii="Times New Roman" w:hAnsi="Times New Roman" w:cs="Times New Roman"/>
+        </w:rPr>
+        <w:t>aliqua</w:t>
+      </w:r>
+      <w:proofErr w:type="spellEnd"/>
+      <w:r>
+        <w:rPr>
+          <w:rFonts w:ascii="Times New Roman" w:hAnsi="Times New Roman" w:cs="Times New Roman"/>
+        </w:rPr>
+        <w:t xml:space="preserve">. Ut </w:t>
+      </w:r>
+      <w:proofErr w:type="spellStart"/>
+      <w:r>
+        <w:rPr>
+          <w:rFonts w:ascii="Times New Roman" w:hAnsi="Times New Roman" w:cs="Times New Roman"/>
+        </w:rPr>
+        <w:t>enim</w:t>
+      </w:r>
+      <w:proofErr w:type="spellEnd"/>
+      <w:r>
+        <w:rPr>
+          <w:rFonts w:ascii="Times New Roman" w:hAnsi="Times New Roman" w:cs="Times New Roman"/>
+        </w:rPr>
+        <w:t xml:space="preserve"> ad minim </w:t>
+      </w:r>
+      <w:proofErr w:type="spellStart"/>
+      <w:r>
+        <w:rPr>
+          <w:rFonts w:ascii="Times New Roman" w:hAnsi="Times New Roman" w:cs="Times New Roman"/>
+        </w:rPr>
+        <w:t>veniam</w:t>
+      </w:r>
+      <w:proofErr w:type="spellEnd"/>
+      <w:r>
+        <w:rPr>
+          <w:rFonts w:ascii="Times New Roman" w:hAnsi="Times New Roman" w:cs="Times New Roman"/>
+        </w:rPr>
+        <w:t xml:space="preserve">, quis </w:t>
+      </w:r>
+      <w:proofErr w:type="spellStart"/>
+      <w:r>
+        <w:rPr>
+          <w:rFonts w:ascii="Times New Roman" w:hAnsi="Times New Roman" w:cs="Times New Roman"/>
+        </w:rPr>
+        <w:t>nostrud</w:t>
+      </w:r>
+      <w:proofErr w:type="spellEnd"/>
+      <w:r>
+        <w:rPr>
+          <w:rFonts w:ascii="Times New Roman" w:hAnsi="Times New Roman" w:cs="Times New Roman"/>
+        </w:rPr>
+        <w:t xml:space="preserve"> exercitation </w:t>
+      </w:r>
+      <w:proofErr w:type="spellStart"/>
+      <w:r>
+        <w:rPr>
+          <w:rFonts w:ascii="Times New Roman" w:hAnsi="Times New Roman" w:cs="Times New Roman"/>
+        </w:rPr>
+        <w:t>ullamco</w:t>
+      </w:r>
+      <w:proofErr w:type="spellEnd"/>
+      <w:r>
+        <w:rPr>
+          <w:rFonts w:ascii="Times New Roman" w:hAnsi="Times New Roman" w:cs="Times New Roman"/>
+        </w:rPr>
+        <w:t xml:space="preserve"> </w:t>
+      </w:r>
+      <w:proofErr w:type="spellStart"/>
+      <w:r>
+        <w:rPr>
+          <w:rFonts w:ascii="Times New Roman" w:hAnsi="Times New Roman" w:cs="Times New Roman"/>
+        </w:rPr>
+        <w:t>laboris</w:t>
+      </w:r>
+      <w:proofErr w:type="spellEnd"/>
+      <w:r>
+        <w:rPr>
+          <w:rFonts w:ascii="Times New Roman" w:hAnsi="Times New Roman" w:cs="Times New Roman"/>
+        </w:rPr>
+        <w:t xml:space="preserve"> nisi </w:t>
+      </w:r>
+      <w:proofErr w:type="spellStart"/>
+      <w:r>
+        <w:rPr>
+          <w:rFonts w:ascii="Times New Roman" w:hAnsi="Times New Roman" w:cs="Times New Roman"/>
+        </w:rPr>
+        <w:t>ut</w:t>
+      </w:r>
+      <w:proofErr w:type="spellEnd"/>
+      <w:r>
+        <w:rPr>
+          <w:rFonts w:ascii="Times New Roman" w:hAnsi="Times New Roman" w:cs="Times New Roman"/>
+        </w:rPr>
+        <w:t xml:space="preserve"> </w:t>
+      </w:r>
+      <w:proofErr w:type="spellStart"/>
+      <w:r>
+        <w:rPr>
+          <w:rFonts w:ascii="Times New Roman" w:hAnsi="Times New Roman" w:cs="Times New Roman"/>
+        </w:rPr>
+        <w:t>aliquip</w:t>
+      </w:r>
+      <w:proofErr w:type="spellEnd"/>
+      <w:r>
+        <w:rPr>
+          <w:rFonts w:ascii="Times New Roman" w:hAnsi="Times New Roman" w:cs="Times New Roman"/>
+        </w:rPr>
+        <w:t xml:space="preserve"> ex </w:t>
+      </w:r>
+      <w:proofErr w:type="spellStart"/>
+      <w:r>
+        <w:rPr>
+          <w:rFonts w:ascii="Times New Roman" w:hAnsi="Times New Roman" w:cs="Times New Roman"/>
+        </w:rPr>
+        <w:t>ea</w:t>
+      </w:r>
+      <w:proofErr w:type="spellEnd"/>
+      <w:r>
+        <w:rPr>
+          <w:rFonts w:ascii="Times New Roman" w:hAnsi="Times New Roman" w:cs="Times New Roman"/>
+        </w:rPr>
+        <w:t xml:space="preserve"> </w:t>
+      </w:r>
+      <w:proofErr w:type="spellStart"/>
+      <w:r>
+        <w:rPr>
+          <w:rFonts w:ascii="Times New Roman" w:hAnsi="Times New Roman" w:cs="Times New Roman"/>
+        </w:rPr>
+        <w:t>commodo</w:t>
+      </w:r>
+      <w:proofErr w:type="spellEnd"/>
+      <w:r>
+        <w:rPr>
+          <w:rFonts w:ascii="Times New Roman" w:hAnsi="Times New Roman" w:cs="Times New Roman"/>
+        </w:rPr>
+        <w:t xml:space="preserve"> </w:t>
+      </w:r>
+      <w:proofErr w:type="spellStart"/>
+      <w:r>
+        <w:rPr>
+          <w:rFonts w:ascii="Times New Roman" w:hAnsi="Times New Roman" w:cs="Times New Roman"/>
+        </w:rPr>
+        <w:t>consequat</w:t>
+      </w:r>
+      <w:proofErr w:type="spellEnd"/>
+      <w:r>
+        <w:rPr>
+          <w:rFonts w:ascii="Times New Roman" w:hAnsi="Times New Roman" w:cs="Times New Roman"/>
+        </w:rPr>
+        <w:t xml:space="preserve">. Duis </w:t>
+      </w:r>
+      <w:proofErr w:type="spellStart"/>
+      <w:r>
+        <w:rPr>
+          <w:rFonts w:ascii="Times New Roman" w:hAnsi="Times New Roman" w:cs="Times New Roman"/>
+        </w:rPr>
+        <w:t>aute</w:t>
+      </w:r>
+      <w:proofErr w:type="spellEnd"/>
+      <w:r>
+        <w:rPr>
+          <w:rFonts w:ascii="Times New Roman" w:hAnsi="Times New Roman" w:cs="Times New Roman"/>
+        </w:rPr>
+        <w:t xml:space="preserve"> </w:t>
+      </w:r>
+      <w:proofErr w:type="spellStart"/>
+      <w:r>
+        <w:rPr>
+          <w:rFonts w:ascii="Times New Roman" w:hAnsi="Times New Roman" w:cs="Times New Roman"/>
+        </w:rPr>
+        <w:t>irure</w:t>
+      </w:r>
+      <w:proofErr w:type="spellEnd"/>
+      <w:r>
+        <w:rPr>
+          <w:rFonts w:ascii="Times New Roman" w:hAnsi="Times New Roman" w:cs="Times New Roman"/>
+        </w:rPr>
+        <w:t xml:space="preserve"> </w:t>
+      </w:r>
+      <w:proofErr w:type="spellStart"/>
+      <w:r>
+        <w:rPr>
+          <w:rFonts w:ascii="Times New Roman" w:hAnsi="Times New Roman" w:cs="Times New Roman"/>
+        </w:rPr>
+        <w:t>dolor</w:t>
+      </w:r>
+      <w:proofErr w:type="spellEnd"/>
+      <w:r>
+        <w:rPr>
+          <w:rFonts w:ascii="Times New Roman" w:hAnsi="Times New Roman" w:cs="Times New Roman"/>
+        </w:rPr>
+        <w:t xml:space="preserve"> in </w:t>
+      </w:r>
+      <w:proofErr w:type="spellStart"/>
+      <w:r>
+        <w:rPr>
+          <w:rFonts w:ascii="Times New Roman" w:hAnsi="Times New Roman" w:cs="Times New Roman"/>
+        </w:rPr>
+        <w:t>reprehenderit</w:t>
+      </w:r>
+      <w:proofErr w:type="spellEnd"/>
+      <w:r>
+        <w:rPr>
+          <w:rFonts w:ascii="Times New Roman" w:hAnsi="Times New Roman" w:cs="Times New Roman"/>
+        </w:rPr>
+        <w:t xml:space="preserve"> in </w:t>
+      </w:r>
+      <w:proofErr w:type="spellStart"/>
+      <w:r>
+        <w:rPr>
+          <w:rFonts w:ascii="Times New Roman" w:hAnsi="Times New Roman" w:cs="Times New Roman"/>
+        </w:rPr>
+        <w:t>voluptate</w:t>
+      </w:r>
+      <w:proofErr w:type="spellEnd"/>
+      <w:r>
+        <w:rPr>
+          <w:rFonts w:ascii="Times New Roman" w:hAnsi="Times New Roman" w:cs="Times New Roman"/>
+        </w:rPr>
+        <w:t xml:space="preserve"> </w:t>
+      </w:r>
+      <w:proofErr w:type="spellStart"/>
+      <w:r>
+        <w:rPr>
+          <w:rFonts w:ascii="Times New Roman" w:hAnsi="Times New Roman" w:cs="Times New Roman"/>
+        </w:rPr>
+        <w:t>velit</w:t>
+      </w:r>
+      <w:proofErr w:type="spellEnd"/>
+      <w:r>
+        <w:rPr>
+          <w:rFonts w:ascii="Times New Roman" w:hAnsi="Times New Roman" w:cs="Times New Roman"/>
+        </w:rPr>
+        <w:t xml:space="preserve"> esse </w:t>
+      </w:r>
+      <w:proofErr w:type="spellStart"/>
+      <w:r>
+        <w:rPr>
+          <w:rFonts w:ascii="Times New Roman" w:hAnsi="Times New Roman" w:cs="Times New Roman"/>
+        </w:rPr>
+        <w:t>cillum</w:t>
+      </w:r>
+      <w:proofErr w:type="spellEnd"/>
+      <w:r>
+        <w:rPr>
+          <w:rFonts w:ascii="Times New Roman" w:hAnsi="Times New Roman" w:cs="Times New Roman"/>
+        </w:rPr>
+        <w:t xml:space="preserve"> dolore </w:t>
+      </w:r>
+      <w:proofErr w:type="spellStart"/>
+      <w:r>
+        <w:rPr>
+          <w:rFonts w:ascii="Times New Roman" w:hAnsi="Times New Roman" w:cs="Times New Roman"/>
+        </w:rPr>
+        <w:t>eu</w:t>
+      </w:r>
+      <w:proofErr w:type="spellEnd"/>
+      <w:r>
+        <w:rPr>
+          <w:rFonts w:ascii="Times New Roman" w:hAnsi="Times New Roman" w:cs="Times New Roman"/>
+        </w:rPr>
+        <w:t xml:space="preserve"> </w:t>
+      </w:r>
+      <w:proofErr w:type="spellStart"/>
+      <w:r>
+        <w:rPr>
+          <w:rFonts w:ascii="Times New Roman" w:hAnsi="Times New Roman" w:cs="Times New Roman"/>
+        </w:rPr>
+        <w:t>fugiat</w:t>
+      </w:r>
+      <w:proofErr w:type="spellEnd"/>
+      <w:r>
+        <w:rPr>
+          <w:rFonts w:ascii="Times New Roman" w:hAnsi="Times New Roman" w:cs="Times New Roman"/>
+        </w:rPr>
+        <w:t xml:space="preserve"> </w:t>
+      </w:r>
+      <w:proofErr w:type="spellStart"/>
+      <w:r>
+        <w:rPr>
+          <w:rFonts w:ascii="Times New Roman" w:hAnsi="Times New Roman" w:cs="Times New Roman"/>
+        </w:rPr>
+        <w:t>nulla</w:t>
+      </w:r>
+      <w:proofErr w:type="spellEnd"/>
+      <w:r>
+        <w:rPr>
+          <w:rFonts w:ascii="Times New Roman" w:hAnsi="Times New Roman" w:cs="Times New Roman"/>
+        </w:rPr>
+        <w:t xml:space="preserve"> </w:t>
+      </w:r>
+      <w:proofErr w:type="spellStart"/>
+      <w:r>
+        <w:rPr>
+          <w:rFonts w:ascii="Times New Roman" w:hAnsi="Times New Roman" w:cs="Times New Roman"/>
+        </w:rPr>
+        <w:t>pariatur</w:t>
+      </w:r>
+      <w:proofErr w:type="spellEnd"/>
+      <w:r>
+        <w:rPr>
+          <w:rFonts w:ascii="Times New Roman" w:hAnsi="Times New Roman" w:cs="Times New Roman"/>
+        </w:rPr>
+        <w:t xml:space="preserve">. </w:t>
+      </w:r>
+      <w:proofErr w:type="spellStart"/>
+      <w:r>
+        <w:rPr>
+          <w:rFonts w:ascii="Times New Roman" w:hAnsi="Times New Roman" w:cs="Times New Roman"/>
+        </w:rPr>
+        <w:t>Excepteur</w:t>
+      </w:r>
+      <w:proofErr w:type="spellEnd"/>
+      <w:r>
+        <w:rPr>
+          <w:rFonts w:ascii="Times New Roman" w:hAnsi="Times New Roman" w:cs="Times New Roman"/>
+        </w:rPr>
+        <w:t xml:space="preserve"> </w:t>
+      </w:r>
+      <w:proofErr w:type="spellStart"/>
+      <w:r>
+        <w:rPr>
+          <w:rFonts w:ascii="Times New Roman" w:hAnsi="Times New Roman" w:cs="Times New Roman"/>
+        </w:rPr>
+        <w:t>sint</w:t>
+      </w:r>
+      <w:proofErr w:type="spellEnd"/>
+      <w:r>
+        <w:rPr>
+          <w:rFonts w:ascii="Times New Roman" w:hAnsi="Times New Roman" w:cs="Times New Roman"/>
+        </w:rPr>
+        <w:t xml:space="preserve"> </w:t>
+      </w:r>
+      <w:proofErr w:type="spellStart"/>
+      <w:r>
+        <w:rPr>
+          <w:rFonts w:ascii="Times New Roman" w:hAnsi="Times New Roman" w:cs="Times New Roman"/>
+        </w:rPr>
+        <w:t>occaecat</w:t>
+      </w:r>
+      <w:proofErr w:type="spellEnd"/>
+      <w:r>
+        <w:rPr>
+          <w:rFonts w:ascii="Times New Roman" w:hAnsi="Times New Roman" w:cs="Times New Roman"/>
+        </w:rPr>
+        <w:t xml:space="preserve"> </w:t>
+      </w:r>
+      <w:proofErr w:type="spellStart"/>
+      <w:r>
+        <w:rPr>
+          <w:rFonts w:ascii="Times New Roman" w:hAnsi="Times New Roman" w:cs="Times New Roman"/>
+        </w:rPr>
+        <w:t>cupidatat</w:t>
+      </w:r>
+      <w:proofErr w:type="spellEnd"/>
+      <w:r>
+        <w:rPr>
+          <w:rFonts w:ascii="Times New Roman" w:hAnsi="Times New Roman" w:cs="Times New Roman"/>
+        </w:rPr>
+        <w:t xml:space="preserve"> non </w:t>
+      </w:r>
+      <w:proofErr w:type="spellStart"/>
+      <w:r>
+        <w:rPr>
+          <w:rFonts w:ascii="Times New Roman" w:hAnsi="Times New Roman" w:cs="Times New Roman"/>
+        </w:rPr>
+        <w:t>proident</w:t>
+      </w:r>
+      <w:proofErr w:type="spellEnd"/>
+      <w:r>
+        <w:rPr>
+          <w:rFonts w:ascii="Times New Roman" w:hAnsi="Times New Roman" w:cs="Times New Roman"/>
+        </w:rPr>
+        <w:t xml:space="preserve">, sunt in culpa qui </w:t>
+      </w:r>
+      <w:proofErr w:type="spellStart"/>
+      <w:r>
+        <w:rPr>
+          <w:rFonts w:ascii="Times New Roman" w:hAnsi="Times New Roman" w:cs="Times New Roman"/>
+        </w:rPr>
+        <w:t>officia</w:t>
+      </w:r>
+      <w:proofErr w:type="spellEnd"/>
+      <w:r>
+        <w:rPr>
+          <w:rFonts w:ascii="Times New Roman" w:hAnsi="Times New Roman" w:cs="Times New Roman"/>
+        </w:rPr>
+        <w:t xml:space="preserve"> </w:t>
+      </w:r>
+      <w:proofErr w:type="spellStart"/>
+      <w:r>
+        <w:rPr>
+          <w:rFonts w:ascii="Times New Roman" w:hAnsi="Times New Roman" w:cs="Times New Roman"/>
+        </w:rPr>
+        <w:t>deserunt</w:t>
+      </w:r>
+      <w:proofErr w:type="spellEnd"/>
+      <w:r>
+        <w:rPr>
+          <w:rFonts w:ascii="Times New Roman" w:hAnsi="Times New Roman" w:cs="Times New Roman"/>
+        </w:rPr>
+        <w:t xml:space="preserve"> </w:t>
+      </w:r>
+      <w:proofErr w:type="spellStart"/>
+      <w:r>
+        <w:rPr>
+          <w:rFonts w:ascii="Times New Roman" w:hAnsi="Times New Roman" w:cs="Times New Roman"/>
+        </w:rPr>
+        <w:t>mollit</w:t>
+      </w:r>
+      <w:proofErr w:type="spellEnd"/>
+      <w:r>
+        <w:rPr>
+          <w:rFonts w:ascii="Times New Roman" w:hAnsi="Times New Roman" w:cs="Times New Roman"/>
+        </w:rPr>
+        <w:t xml:space="preserve"> </w:t>
+      </w:r>
+      <w:proofErr w:type="spellStart"/>
+      <w:r>
+        <w:rPr>
+          <w:rFonts w:ascii="Times New Roman" w:hAnsi="Times New Roman" w:cs="Times New Roman"/>
+        </w:rPr>
+        <w:t>anim</w:t>
+      </w:r>
+      <w:proofErr w:type="spellEnd"/>
+      <w:r>
+        <w:rPr>
+          <w:rFonts w:ascii="Times New Roman" w:hAnsi="Times New Roman" w:cs="Times New Roman"/>
+        </w:rPr>
+        <w:t xml:space="preserve"> id est </w:t>
+      </w:r>
+      <w:proofErr w:type="spellStart"/>
+      <w:r>
+        <w:rPr>
+          <w:rFonts w:ascii="Times New Roman" w:hAnsi="Times New Roman" w:cs="Times New Roman"/>
+        </w:rPr>
+        <w:t>laborum</w:t>
+      </w:r>
+      <w:proofErr w:type="spellEnd"/>
+      <w:r>
+        <w:rPr>
+          <w:rFonts w:ascii="Times New Roman" w:hAnsi="Times New Roman" w:cs="Times New Roman"/>
+        </w:rPr>
+        <w:t>.&gt;</w:t>
+      </w:r>
+    </w:p>
+    <w:p>
+      <w:pPr>
+        <w:rPr>
+          <w:rFonts w:ascii="Times New Roman" w:hAnsi="Times New Roman" w:cs="Times New Roman"/>
+        </w:rPr>
+      </w:pPr>
+    </w:p>
+    <w:p>
+      <w:pPr>
         <w:pStyle w:val="Heading1"/>
         <w:jc w:val="both"/>
         <w:rPr>
@@ -9933,7 +8906,7 @@
         </w:rPr>
         <w:t>Interactions Service</w:t>
       </w:r>
-      <w:bookmarkEnd w:id="26"/>
+      <w:bookmarkEnd w:id="28"/>
       <w:bookmarkEnd w:id="29"/>
     </w:p>
     <w:p>
@@ -10031,7 +9004,6 @@
         <w:rPr>
           <w:rFonts w:ascii="Times New Roman" w:hAnsi="Times New Roman" w:cs="Times New Roman"/>
         </w:rPr>
-        <w:lastRenderedPageBreak/>
         <w:t>Unauthorized access to RN or SIS resources.</w:t>
       </w:r>
     </w:p>
@@ -10160,6 +9132,7 @@
         <w:rPr>
           <w:rFonts w:ascii="Times New Roman" w:hAnsi="Times New Roman" w:cs="Times New Roman"/>
         </w:rPr>
+        <w:lastRenderedPageBreak/>
         <w:t>Hypertext Transfer Protocol Secure (HTTPS) APIs</w:t>
       </w:r>
       <w:bookmarkEnd w:id="31"/>
@@ -10746,7 +9719,6 @@
               <w:rPr>
                 <w:rFonts w:ascii="Times New Roman" w:hAnsi="Times New Roman" w:cs="Times New Roman"/>
               </w:rPr>
-              <w:lastRenderedPageBreak/>
               <w:t>4</w:t>
             </w:r>
           </w:p>
@@ -11010,6 +9982,7 @@
               <w:rPr>
                 <w:rFonts w:ascii="Times New Roman" w:hAnsi="Times New Roman" w:cs="Times New Roman"/>
               </w:rPr>
+              <w:lastRenderedPageBreak/>
               <w:t>GetTransferState</w:t>
             </w:r>
             <w:proofErr w:type="spellEnd"/>
@@ -12081,14 +11054,7 @@
         <w:rPr>
           <w:rFonts w:ascii="Times New Roman" w:hAnsi="Times New Roman" w:cs="Times New Roman"/>
         </w:rPr>
-        <w:t xml:space="preserve">introduced and that time the Authorization Token will </w:t>
-      </w:r>
-      <w:r>
-        <w:rPr>
-          <w:rFonts w:ascii="Times New Roman" w:hAnsi="Times New Roman" w:cs="Times New Roman"/>
-        </w:rPr>
-        <w:lastRenderedPageBreak/>
-        <w:t>be required</w:t>
+        <w:t>introduced and that time the Authorization Token will be required</w:t>
       </w:r>
       <w:r>
         <w:rPr>
@@ -12377,6 +11343,7 @@
                 <w:bCs/>
                 <w:color w:val="000000"/>
               </w:rPr>
+              <w:lastRenderedPageBreak/>
               <w:t>Reference</w:t>
             </w:r>
           </w:p>
@@ -13946,6 +12913,7 @@
         <w:rPr>
           <w:rFonts w:ascii="Times New Roman" w:hAnsi="Times New Roman" w:cs="Times New Roman"/>
         </w:rPr>
+        <w:lastRenderedPageBreak/>
         <w:t>Sample Response JSON</w:t>
       </w:r>
     </w:p>
@@ -14770,7 +13738,6 @@
         <w:rPr>
           <w:rFonts w:ascii="Times New Roman" w:hAnsi="Times New Roman" w:cs="Times New Roman"/>
         </w:rPr>
-        <w:lastRenderedPageBreak/>
         <w:t xml:space="preserve">Response Schema </w:t>
       </w:r>
     </w:p>
@@ -15175,6 +14142,7 @@
                 <w:rFonts w:ascii="Times New Roman" w:hAnsi="Times New Roman" w:cs="Times New Roman"/>
                 <w:color w:val="000000"/>
               </w:rPr>
+              <w:lastRenderedPageBreak/>
               <w:t>ETag</w:t>
             </w:r>
           </w:p>
@@ -16045,7 +15013,6 @@
         <w:rPr>
           <w:rFonts w:ascii="Times New Roman" w:hAnsi="Times New Roman" w:cs="Times New Roman"/>
         </w:rPr>
-        <w:lastRenderedPageBreak/>
         <w:t>Request Body</w:t>
       </w:r>
     </w:p>
@@ -17617,7 +16584,6 @@
               <w:rPr>
                 <w:rFonts w:ascii="Times New Roman" w:hAnsi="Times New Roman" w:cs="Times New Roman"/>
               </w:rPr>
-              <w:lastRenderedPageBreak/>
               <w:t>OperationType</w:t>
             </w:r>
             <w:proofErr w:type="spellEnd"/>
@@ -17848,6 +16814,7 @@
         <w:rPr>
           <w:rFonts w:ascii="Times New Roman" w:hAnsi="Times New Roman" w:cs="Times New Roman"/>
         </w:rPr>
+        <w:lastRenderedPageBreak/>
         <w:t>Request Body</w:t>
       </w:r>
     </w:p>
@@ -24474,20 +23441,6 @@
         <w:rPr>
           <w:rFonts w:ascii="Times New Roman" w:hAnsi="Times New Roman" w:cs="Times New Roman"/>
         </w:rPr>
-        <w:t>6.14</w:t>
-      </w:r>
-      <w:r>
-        <w:rPr>
-          <w:rFonts w:ascii="Times New Roman" w:hAnsi="Times New Roman" w:cs="Times New Roman"/>
-          <w:sz w:val="14"/>
-          <w:szCs w:val="14"/>
-        </w:rPr>
-        <w:t xml:space="preserve">      </w:t>
-      </w:r>
-      <w:r>
-        <w:rPr>
-          <w:rFonts w:ascii="Times New Roman" w:hAnsi="Times New Roman" w:cs="Times New Roman"/>
-        </w:rPr>
         <w:t>Response Codes</w:t>
       </w:r>
       <w:bookmarkEnd w:id="54"/>
@@ -25100,15 +24053,7 @@
         <w:rPr>
           <w:rFonts w:ascii="Times New Roman" w:hAnsi="Times New Roman" w:cs="Times New Roman"/>
         </w:rPr>
-        <w:t>6.15</w:t>
-      </w:r>
-      <w:r>
-        <w:rPr>
-          <w:rFonts w:ascii="Times New Roman" w:hAnsi="Times New Roman" w:cs="Times New Roman"/>
-          <w:sz w:val="14"/>
-          <w:szCs w:val="14"/>
-        </w:rPr>
-        <w:t xml:space="preserve">      </w:t>
+        <w:t xml:space="preserve"> </w:t>
       </w:r>
       <w:r>
         <w:rPr>
@@ -27640,7 +26585,6 @@
     <w:next w:val="Normal"/>
     <w:link w:val="Heading5Char"/>
     <w:uiPriority w:val="9"/>
-    <w:semiHidden/>
     <w:unhideWhenUsed/>
     <w:qFormat/>
     <w:rsid w:val="008147A0"/>
@@ -27665,7 +26609,6 @@
     <w:next w:val="Normal"/>
     <w:link w:val="Heading6Char"/>
     <w:uiPriority w:val="9"/>
-    <w:semiHidden/>
     <w:unhideWhenUsed/>
     <w:qFormat/>
     <w:rsid w:val="008147A0"/>
@@ -27692,7 +26635,6 @@
     <w:next w:val="Normal"/>
     <w:link w:val="Heading7Char"/>
     <w:uiPriority w:val="9"/>
-    <w:semiHidden/>
     <w:unhideWhenUsed/>
     <w:qFormat/>
     <w:rsid w:val="008147A0"/>
@@ -27717,7 +26659,6 @@
     <w:next w:val="Normal"/>
     <w:link w:val="Heading8Char"/>
     <w:uiPriority w:val="9"/>
-    <w:semiHidden/>
     <w:unhideWhenUsed/>
     <w:qFormat/>
     <w:rsid w:val="008147A0"/>
@@ -27744,7 +26685,6 @@
     <w:next w:val="Normal"/>
     <w:link w:val="Heading9Char"/>
     <w:uiPriority w:val="9"/>
-    <w:semiHidden/>
     <w:unhideWhenUsed/>
     <w:qFormat/>
     <w:rsid w:val="008147A0"/>
@@ -27843,7 +26783,6 @@
     <w:basedOn w:val="DefaultParagraphFont"/>
     <w:link w:val="Heading5"/>
     <w:uiPriority w:val="9"/>
-    <w:semiHidden/>
     <w:rsid w:val="008147A0"/>
     <w:rPr>
       <w:rFonts w:eastAsiaTheme="majorEastAsia" w:cstheme="majorBidi"/>
@@ -27855,7 +26794,6 @@
     <w:basedOn w:val="DefaultParagraphFont"/>
     <w:link w:val="Heading6"/>
     <w:uiPriority w:val="9"/>
-    <w:semiHidden/>
     <w:rsid w:val="008147A0"/>
     <w:rPr>
       <w:rFonts w:eastAsiaTheme="majorEastAsia" w:cstheme="majorBidi"/>
@@ -27869,7 +26807,6 @@
     <w:basedOn w:val="DefaultParagraphFont"/>
     <w:link w:val="Heading7"/>
     <w:uiPriority w:val="9"/>
-    <w:semiHidden/>
     <w:rsid w:val="008147A0"/>
     <w:rPr>
       <w:rFonts w:eastAsiaTheme="majorEastAsia" w:cstheme="majorBidi"/>
@@ -27881,7 +26818,6 @@
     <w:basedOn w:val="DefaultParagraphFont"/>
     <w:link w:val="Heading8"/>
     <w:uiPriority w:val="9"/>
-    <w:semiHidden/>
     <w:rsid w:val="008147A0"/>
     <w:rPr>
       <w:rFonts w:eastAsiaTheme="majorEastAsia" w:cstheme="majorBidi"/>
@@ -27895,7 +26831,6 @@
     <w:basedOn w:val="DefaultParagraphFont"/>
     <w:link w:val="Heading9"/>
     <w:uiPriority w:val="9"/>
-    <w:semiHidden/>
     <w:rsid w:val="008147A0"/>
     <w:rPr>
       <w:rFonts w:eastAsiaTheme="majorEastAsia" w:cstheme="majorBidi"/>
@@ -28455,6 +27390,7 @@
   </w:compat>
   <w:rsids>
     <w:rsidRoot w:val="006F1AAA"/>
+    <w:rsid w:val="001107C0"/>
     <w:rsid w:val="00242140"/>
     <w:rsid w:val="003320F4"/>
     <w:rsid w:val="003B6A8A"/>
@@ -28464,6 +27400,7 @@
     <w:rsid w:val="006B32AC"/>
     <w:rsid w:val="006F1AAA"/>
     <w:rsid w:val="009A4C3B"/>
+    <w:rsid w:val="009C594B"/>
     <w:rsid w:val="00D05F18"/>
     <w:rsid w:val="00D16542"/>
     <w:rsid w:val="00D21658"/>

</xml_diff>